<commit_message>
fix: sincroniza alterações locais com a branch remota
</commit_message>
<xml_diff>
--- a/checkpoint 1/ADENDO TÉCNICO DE ARQUITETURA.docx
+++ b/checkpoint 1/ADENDO TÉCNICO DE ARQUITETURA.docx
@@ -86,87 +86,7 @@
           <w:szCs w:val="26"/>
           <w:lang w:eastAsia="pt-BR"/>
         </w:rPr>
-        <w:t xml:space="preserve"> </w:t>
-      </w:r>
-      <w:proofErr w:type="spellStart"/>
-      <w:r>
-        <w:rPr>
-          <w:rFonts w:ascii="Times New Roman" w:eastAsia="Times New Roman" w:hAnsi="Times New Roman" w:cs="Times New Roman"/>
-          <w:sz w:val="26"/>
-          <w:szCs w:val="26"/>
-          <w:lang w:eastAsia="pt-BR"/>
-        </w:rPr>
-        <w:t>Refatoração</w:t>
-      </w:r>
-      <w:proofErr w:type="spellEnd"/>
-      <w:r>
-        <w:rPr>
-          <w:rFonts w:ascii="Times New Roman" w:eastAsia="Times New Roman" w:hAnsi="Times New Roman" w:cs="Times New Roman"/>
-          <w:sz w:val="26"/>
-          <w:szCs w:val="26"/>
-          <w:lang w:eastAsia="pt-BR"/>
-        </w:rPr>
-        <w:t xml:space="preserve"> e </w:t>
-      </w:r>
-      <w:proofErr w:type="spellStart"/>
-      <w:r>
-        <w:rPr>
-          <w:rFonts w:ascii="Times New Roman" w:eastAsia="Times New Roman" w:hAnsi="Times New Roman" w:cs="Times New Roman"/>
-          <w:sz w:val="26"/>
-          <w:szCs w:val="26"/>
-          <w:lang w:eastAsia="pt-BR"/>
-        </w:rPr>
-        <w:t>Modurarização</w:t>
-      </w:r>
-      <w:proofErr w:type="spellEnd"/>
-      <w:r>
-        <w:rPr>
-          <w:rFonts w:ascii="Times New Roman" w:eastAsia="Times New Roman" w:hAnsi="Times New Roman" w:cs="Times New Roman"/>
-          <w:sz w:val="26"/>
-          <w:szCs w:val="26"/>
-          <w:lang w:eastAsia="pt-BR"/>
-        </w:rPr>
-        <w:t xml:space="preserve"> de Código (</w:t>
-      </w:r>
-      <w:proofErr w:type="spellStart"/>
-      <w:r>
-        <w:rPr>
-          <w:rFonts w:ascii="Times New Roman" w:eastAsia="Times New Roman" w:hAnsi="Times New Roman" w:cs="Times New Roman"/>
-          <w:sz w:val="26"/>
-          <w:szCs w:val="26"/>
-          <w:lang w:eastAsia="pt-BR"/>
-        </w:rPr>
-        <w:t>Code</w:t>
-      </w:r>
-      <w:proofErr w:type="spellEnd"/>
-      <w:r>
-        <w:rPr>
-          <w:rFonts w:ascii="Times New Roman" w:eastAsia="Times New Roman" w:hAnsi="Times New Roman" w:cs="Times New Roman"/>
-          <w:sz w:val="26"/>
-          <w:szCs w:val="26"/>
-          <w:lang w:eastAsia="pt-BR"/>
-        </w:rPr>
-        <w:t xml:space="preserve"> </w:t>
-      </w:r>
-      <w:proofErr w:type="spellStart"/>
-      <w:r>
-        <w:rPr>
-          <w:rFonts w:ascii="Times New Roman" w:eastAsia="Times New Roman" w:hAnsi="Times New Roman" w:cs="Times New Roman"/>
-          <w:sz w:val="26"/>
-          <w:szCs w:val="26"/>
-          <w:lang w:eastAsia="pt-BR"/>
-        </w:rPr>
-        <w:t>Refactoring</w:t>
-      </w:r>
-      <w:proofErr w:type="spellEnd"/>
-      <w:r>
-        <w:rPr>
-          <w:rFonts w:ascii="Times New Roman" w:eastAsia="Times New Roman" w:hAnsi="Times New Roman" w:cs="Times New Roman"/>
-          <w:sz w:val="26"/>
-          <w:szCs w:val="26"/>
-          <w:lang w:eastAsia="pt-BR"/>
-        </w:rPr>
-        <w:t>)</w:t>
+        <w:t xml:space="preserve"> Refatoração e Modurarização de Código (Code Refactoring)</w:t>
       </w:r>
     </w:p>
     <w:p>
@@ -284,7 +204,6 @@
         </w:rPr>
         <w:t xml:space="preserve"> (como cadastro de clientes e ingressos para outros eventos), o aluno deverá </w:t>
       </w:r>
-      <w:proofErr w:type="spellStart"/>
       <w:r>
         <w:rPr>
           <w:rFonts w:ascii="Times New Roman" w:eastAsia="Times New Roman" w:hAnsi="Times New Roman" w:cs="Times New Roman"/>
@@ -294,10 +213,22 @@
           <w:szCs w:val="26"/>
           <w:lang w:eastAsia="pt-BR"/>
         </w:rPr>
-        <w:t>refatorar</w:t>
-      </w:r>
-      <w:proofErr w:type="spellEnd"/>
-      <w:r>
+        <w:t>refatorar o código dividindo o JavaScript em 2 arquivos separados</w:t>
+      </w:r>
+      <w:r>
+        <w:rPr>
+          <w:rFonts w:ascii="Times New Roman" w:eastAsia="Times New Roman" w:hAnsi="Times New Roman" w:cs="Times New Roman"/>
+          <w:sz w:val="26"/>
+          <w:szCs w:val="26"/>
+          <w:lang w:eastAsia="pt-BR"/>
+        </w:rPr>
+        <w:t>.</w:t>
+      </w:r>
+    </w:p>
+    <w:p>
+      <w:pPr>
+        <w:spacing w:before="100" w:beforeAutospacing="1" w:after="100" w:afterAutospacing="1" w:line="240" w:lineRule="auto"/>
+        <w:outlineLvl w:val="3"/>
         <w:rPr>
           <w:rFonts w:ascii="Times New Roman" w:eastAsia="Times New Roman" w:hAnsi="Times New Roman" w:cs="Times New Roman"/>
           <w:b/>
@@ -306,9 +237,7 @@
           <w:szCs w:val="26"/>
           <w:lang w:eastAsia="pt-BR"/>
         </w:rPr>
-        <w:t xml:space="preserve"> o código dividindo o </w:t>
-      </w:r>
-      <w:proofErr w:type="spellStart"/>
+      </w:pPr>
       <w:r>
         <w:rPr>
           <w:rFonts w:ascii="Times New Roman" w:eastAsia="Times New Roman" w:hAnsi="Times New Roman" w:cs="Times New Roman"/>
@@ -318,58 +247,12 @@
           <w:szCs w:val="26"/>
           <w:lang w:eastAsia="pt-BR"/>
         </w:rPr>
-        <w:t>JavaScript</w:t>
-      </w:r>
-      <w:proofErr w:type="spellEnd"/>
-      <w:r>
-        <w:rPr>
-          <w:rFonts w:ascii="Times New Roman" w:eastAsia="Times New Roman" w:hAnsi="Times New Roman" w:cs="Times New Roman"/>
-          <w:b/>
-          <w:bCs/>
-          <w:sz w:val="26"/>
-          <w:szCs w:val="26"/>
-          <w:lang w:eastAsia="pt-BR"/>
-        </w:rPr>
-        <w:t xml:space="preserve"> em 2 arquivos separados</w:t>
-      </w:r>
-      <w:r>
-        <w:rPr>
-          <w:rFonts w:ascii="Times New Roman" w:eastAsia="Times New Roman" w:hAnsi="Times New Roman" w:cs="Times New Roman"/>
-          <w:sz w:val="26"/>
-          <w:szCs w:val="26"/>
-          <w:lang w:eastAsia="pt-BR"/>
-        </w:rPr>
-        <w:t>.</w:t>
+        <w:t>2. Divisão de Responsabilidades dos Arquivos</w:t>
       </w:r>
     </w:p>
     <w:p>
       <w:pPr>
         <w:spacing w:before="100" w:beforeAutospacing="1" w:after="100" w:afterAutospacing="1" w:line="240" w:lineRule="auto"/>
-        <w:outlineLvl w:val="3"/>
-        <w:rPr>
-          <w:rFonts w:ascii="Times New Roman" w:eastAsia="Times New Roman" w:hAnsi="Times New Roman" w:cs="Times New Roman"/>
-          <w:b/>
-          <w:bCs/>
-          <w:sz w:val="26"/>
-          <w:szCs w:val="26"/>
-          <w:lang w:eastAsia="pt-BR"/>
-        </w:rPr>
-      </w:pPr>
-      <w:r>
-        <w:rPr>
-          <w:rFonts w:ascii="Times New Roman" w:eastAsia="Times New Roman" w:hAnsi="Times New Roman" w:cs="Times New Roman"/>
-          <w:b/>
-          <w:bCs/>
-          <w:sz w:val="26"/>
-          <w:szCs w:val="26"/>
-          <w:lang w:eastAsia="pt-BR"/>
-        </w:rPr>
-        <w:t>2. Divisão de Responsabilidades dos Arquivos</w:t>
-      </w:r>
-    </w:p>
-    <w:p>
-      <w:pPr>
-        <w:spacing w:before="100" w:beforeAutospacing="1" w:after="100" w:afterAutospacing="1" w:line="240" w:lineRule="auto"/>
         <w:rPr>
           <w:rFonts w:ascii="Times New Roman" w:eastAsia="Times New Roman" w:hAnsi="Times New Roman" w:cs="Times New Roman"/>
           <w:sz w:val="26"/>
@@ -397,7 +280,6 @@
           <w:lang w:eastAsia="pt-BR"/>
         </w:rPr>
       </w:pPr>
-      <w:proofErr w:type="spellStart"/>
       <w:r>
         <w:rPr>
           <w:rFonts w:ascii="Times New Roman" w:eastAsia="Times New Roman" w:hAnsi="Times New Roman" w:cs="Times New Roman"/>
@@ -407,7 +289,6 @@
         </w:rPr>
         <w:t>Plaintext</w:t>
       </w:r>
-      <w:proofErr w:type="spellEnd"/>
     </w:p>
     <w:p>
       <w:pPr>
@@ -444,19 +325,8 @@
           <w:szCs w:val="26"/>
           <w:lang w:eastAsia="pt-BR"/>
         </w:rPr>
-        <w:t>/</w:t>
-      </w:r>
-      <w:proofErr w:type="spellStart"/>
-      <w:r>
-        <w:rPr>
-          <w:rFonts w:ascii="Times New Roman" w:eastAsia="Times New Roman" w:hAnsi="Times New Roman" w:cs="Times New Roman"/>
-          <w:sz w:val="26"/>
-          <w:szCs w:val="26"/>
-          <w:lang w:eastAsia="pt-BR"/>
-        </w:rPr>
-        <w:t>js</w:t>
-      </w:r>
-      <w:proofErr w:type="spellEnd"/>
+        <w:t>/js</w:t>
+      </w:r>
     </w:p>
     <w:p>
       <w:pPr>
@@ -493,27 +363,7 @@
           <w:szCs w:val="26"/>
           <w:lang w:eastAsia="pt-BR"/>
         </w:rPr>
-        <w:t xml:space="preserve">  ├── </w:t>
-      </w:r>
-      <w:proofErr w:type="gramStart"/>
-      <w:r>
-        <w:rPr>
-          <w:rFonts w:ascii="Times New Roman" w:eastAsia="Times New Roman" w:hAnsi="Times New Roman" w:cs="Times New Roman"/>
-          <w:sz w:val="26"/>
-          <w:szCs w:val="26"/>
-          <w:lang w:eastAsia="pt-BR"/>
-        </w:rPr>
-        <w:t>utils.js  &lt;</w:t>
-      </w:r>
-      <w:proofErr w:type="gramEnd"/>
-      <w:r>
-        <w:rPr>
-          <w:rFonts w:ascii="Times New Roman" w:eastAsia="Times New Roman" w:hAnsi="Times New Roman" w:cs="Times New Roman"/>
-          <w:sz w:val="26"/>
-          <w:szCs w:val="26"/>
-          <w:lang w:eastAsia="pt-BR"/>
-        </w:rPr>
-        <w:t>-- (Módulo Genérico / Reutilizável)</w:t>
+        <w:t xml:space="preserve">  ├── utils.js  &lt;-- (Módulo Genérico / Reutilizável)</w:t>
       </w:r>
     </w:p>
     <w:p>
@@ -879,27 +729,7 @@
                 <w:szCs w:val="26"/>
                 <w:lang w:eastAsia="pt-BR"/>
               </w:rPr>
-              <w:t>1. Algoritmo de Validação do CPF (</w:t>
-            </w:r>
-            <w:proofErr w:type="spellStart"/>
-            <w:r>
-              <w:rPr>
-                <w:rFonts w:ascii="Times New Roman" w:eastAsia="Times New Roman" w:hAnsi="Times New Roman" w:cs="Times New Roman"/>
-                <w:sz w:val="26"/>
-                <w:szCs w:val="26"/>
-                <w:lang w:eastAsia="pt-BR"/>
-              </w:rPr>
-              <w:t>validarCPF</w:t>
-            </w:r>
-            <w:proofErr w:type="spellEnd"/>
-            <w:r>
-              <w:rPr>
-                <w:rFonts w:ascii="Times New Roman" w:eastAsia="Times New Roman" w:hAnsi="Times New Roman" w:cs="Times New Roman"/>
-                <w:sz w:val="26"/>
-                <w:szCs w:val="26"/>
-                <w:lang w:eastAsia="pt-BR"/>
-              </w:rPr>
-              <w:t>).</w:t>
+              <w:t>1. Algoritmo de Validação do CPF (validarCPF).</w:t>
             </w:r>
           </w:p>
           <w:p>
@@ -939,47 +769,7 @@
                 <w:szCs w:val="26"/>
                 <w:lang w:eastAsia="pt-BR"/>
               </w:rPr>
-              <w:t xml:space="preserve">2. Função Genérica de Download de Arquivo TXT via </w:t>
-            </w:r>
-            <w:proofErr w:type="spellStart"/>
-            <w:r>
-              <w:rPr>
-                <w:rFonts w:ascii="Times New Roman" w:eastAsia="Times New Roman" w:hAnsi="Times New Roman" w:cs="Times New Roman"/>
-                <w:sz w:val="26"/>
-                <w:szCs w:val="26"/>
-                <w:lang w:eastAsia="pt-BR"/>
-              </w:rPr>
-              <w:t>Blob</w:t>
-            </w:r>
-            <w:proofErr w:type="spellEnd"/>
-            <w:r>
-              <w:rPr>
-                <w:rFonts w:ascii="Times New Roman" w:eastAsia="Times New Roman" w:hAnsi="Times New Roman" w:cs="Times New Roman"/>
-                <w:sz w:val="26"/>
-                <w:szCs w:val="26"/>
-                <w:lang w:eastAsia="pt-BR"/>
-              </w:rPr>
-              <w:t xml:space="preserve"> (</w:t>
-            </w:r>
-            <w:proofErr w:type="spellStart"/>
-            <w:r>
-              <w:rPr>
-                <w:rFonts w:ascii="Times New Roman" w:eastAsia="Times New Roman" w:hAnsi="Times New Roman" w:cs="Times New Roman"/>
-                <w:sz w:val="26"/>
-                <w:szCs w:val="26"/>
-                <w:lang w:eastAsia="pt-BR"/>
-              </w:rPr>
-              <w:t>salvarDadosEmTXT</w:t>
-            </w:r>
-            <w:proofErr w:type="spellEnd"/>
-            <w:r>
-              <w:rPr>
-                <w:rFonts w:ascii="Times New Roman" w:eastAsia="Times New Roman" w:hAnsi="Times New Roman" w:cs="Times New Roman"/>
-                <w:sz w:val="26"/>
-                <w:szCs w:val="26"/>
-                <w:lang w:eastAsia="pt-BR"/>
-              </w:rPr>
-              <w:t>).</w:t>
+              <w:t>2. Função Genérica de Download de Arquivo TXT via Blob (salvarDadosEmTXT).</w:t>
             </w:r>
           </w:p>
         </w:tc>
@@ -1135,27 +925,7 @@
                 <w:szCs w:val="26"/>
                 <w:lang w:eastAsia="pt-BR"/>
               </w:rPr>
-              <w:t>1. Mapeamento do DOM (</w:t>
-            </w:r>
-            <w:proofErr w:type="spellStart"/>
-            <w:r>
-              <w:rPr>
-                <w:rFonts w:ascii="Times New Roman" w:eastAsia="Times New Roman" w:hAnsi="Times New Roman" w:cs="Times New Roman"/>
-                <w:sz w:val="26"/>
-                <w:szCs w:val="26"/>
-                <w:lang w:eastAsia="pt-BR"/>
-              </w:rPr>
-              <w:t>getElementById</w:t>
-            </w:r>
-            <w:proofErr w:type="spellEnd"/>
-            <w:r>
-              <w:rPr>
-                <w:rFonts w:ascii="Times New Roman" w:eastAsia="Times New Roman" w:hAnsi="Times New Roman" w:cs="Times New Roman"/>
-                <w:sz w:val="26"/>
-                <w:szCs w:val="26"/>
-                <w:lang w:eastAsia="pt-BR"/>
-              </w:rPr>
-              <w:t>).</w:t>
+              <w:t>1. Mapeamento do DOM (getElementById).</w:t>
             </w:r>
           </w:p>
           <w:p>
@@ -1195,47 +965,7 @@
                 <w:szCs w:val="26"/>
                 <w:lang w:eastAsia="pt-BR"/>
               </w:rPr>
-              <w:t xml:space="preserve">2. Função de popular o </w:t>
-            </w:r>
-            <w:proofErr w:type="spellStart"/>
-            <w:r>
-              <w:rPr>
-                <w:rFonts w:ascii="Times New Roman" w:eastAsia="Times New Roman" w:hAnsi="Times New Roman" w:cs="Times New Roman"/>
-                <w:sz w:val="26"/>
-                <w:szCs w:val="26"/>
-                <w:lang w:eastAsia="pt-BR"/>
-              </w:rPr>
-              <w:t>Datalist</w:t>
-            </w:r>
-            <w:proofErr w:type="spellEnd"/>
-            <w:r>
-              <w:rPr>
-                <w:rFonts w:ascii="Times New Roman" w:eastAsia="Times New Roman" w:hAnsi="Times New Roman" w:cs="Times New Roman"/>
-                <w:sz w:val="26"/>
-                <w:szCs w:val="26"/>
-                <w:lang w:eastAsia="pt-BR"/>
-              </w:rPr>
-              <w:t xml:space="preserve"> com </w:t>
-            </w:r>
-            <w:proofErr w:type="spellStart"/>
-            <w:r>
-              <w:rPr>
-                <w:rFonts w:ascii="Times New Roman" w:eastAsia="Times New Roman" w:hAnsi="Times New Roman" w:cs="Times New Roman"/>
-                <w:sz w:val="26"/>
-                <w:szCs w:val="26"/>
-                <w:lang w:eastAsia="pt-BR"/>
-              </w:rPr>
-              <w:t>artistasData</w:t>
-            </w:r>
-            <w:proofErr w:type="spellEnd"/>
-            <w:r>
-              <w:rPr>
-                <w:rFonts w:ascii="Times New Roman" w:eastAsia="Times New Roman" w:hAnsi="Times New Roman" w:cs="Times New Roman"/>
-                <w:sz w:val="26"/>
-                <w:szCs w:val="26"/>
-                <w:lang w:eastAsia="pt-BR"/>
-              </w:rPr>
-              <w:t>.</w:t>
+              <w:t>2. Função de popular o Datalist com artistasData.</w:t>
             </w:r>
           </w:p>
           <w:p>
@@ -1363,27 +1093,7 @@
           <w:szCs w:val="26"/>
           <w:lang w:eastAsia="pt-BR"/>
         </w:rPr>
-        <w:t xml:space="preserve">Oriente os alunos a ajustarem as </w:t>
-      </w:r>
-      <w:proofErr w:type="spellStart"/>
-      <w:r>
-        <w:rPr>
-          <w:rFonts w:ascii="Times New Roman" w:eastAsia="Times New Roman" w:hAnsi="Times New Roman" w:cs="Times New Roman"/>
-          <w:sz w:val="26"/>
-          <w:szCs w:val="26"/>
-          <w:lang w:eastAsia="pt-BR"/>
-        </w:rPr>
-        <w:t>tags</w:t>
-      </w:r>
-      <w:proofErr w:type="spellEnd"/>
-      <w:r>
-        <w:rPr>
-          <w:rFonts w:ascii="Times New Roman" w:eastAsia="Times New Roman" w:hAnsi="Times New Roman" w:cs="Times New Roman"/>
-          <w:sz w:val="26"/>
-          <w:szCs w:val="26"/>
-          <w:lang w:eastAsia="pt-BR"/>
-        </w:rPr>
-        <w:t xml:space="preserve"> &lt;script&gt; no final do index.html. A ordem de importação é </w:t>
+        <w:t xml:space="preserve">Oriente os alunos a ajustarem as tags &lt;script&gt; no final do index.html. A ordem de importação é </w:t>
       </w:r>
       <w:r>
         <w:rPr>
@@ -1403,7 +1113,25 @@
           <w:szCs w:val="26"/>
           <w:lang w:eastAsia="pt-BR"/>
         </w:rPr>
-        <w:t xml:space="preserve"> para que o app.js consiga enxergar as funções criadas nos outros arquivos:</w:t>
+        <w:t xml:space="preserve"> para que o app.js consiga enxergar as funções criadas nos outros arquivos</w:t>
+      </w:r>
+      <w:r>
+        <w:rPr>
+          <w:rFonts w:ascii="Times New Roman" w:eastAsia="Times New Roman" w:hAnsi="Times New Roman" w:cs="Times New Roman"/>
+          <w:sz w:val="26"/>
+          <w:szCs w:val="26"/>
+          <w:lang w:eastAsia="pt-BR"/>
+        </w:rPr>
+        <w:t xml:space="preserve"> e em ordem de atuação</w:t>
+      </w:r>
+      <w:r>
+        <w:rPr>
+          <w:rFonts w:ascii="Times New Roman" w:eastAsia="Times New Roman" w:hAnsi="Times New Roman" w:cs="Times New Roman"/>
+          <w:sz w:val="26"/>
+          <w:szCs w:val="26"/>
+          <w:lang w:eastAsia="pt-BR"/>
+        </w:rPr>
+        <w:t>:</w:t>
       </w:r>
     </w:p>
     <w:p>
@@ -1461,27 +1189,7 @@
           <w:szCs w:val="26"/>
           <w:lang w:eastAsia="pt-BR"/>
         </w:rPr>
-        <w:t xml:space="preserve">    </w:t>
-      </w:r>
-      <w:proofErr w:type="gramStart"/>
-      <w:r>
-        <w:rPr>
-          <w:rFonts w:ascii="Times New Roman" w:eastAsia="Times New Roman" w:hAnsi="Times New Roman" w:cs="Times New Roman"/>
-          <w:sz w:val="26"/>
-          <w:szCs w:val="26"/>
-          <w:lang w:eastAsia="pt-BR"/>
-        </w:rPr>
-        <w:t>&lt;!--</w:t>
-      </w:r>
-      <w:proofErr w:type="gramEnd"/>
-      <w:r>
-        <w:rPr>
-          <w:rFonts w:ascii="Times New Roman" w:eastAsia="Times New Roman" w:hAnsi="Times New Roman" w:cs="Times New Roman"/>
-          <w:sz w:val="26"/>
-          <w:szCs w:val="26"/>
-          <w:lang w:eastAsia="pt-BR"/>
-        </w:rPr>
-        <w:t xml:space="preserve"> 1. Massa de Dados do Festival --&gt;</w:t>
+        <w:t xml:space="preserve">    &lt;!-- 1. Massa de Dados do Festival --&gt;</w:t>
       </w:r>
     </w:p>
     <w:p>
@@ -1528,27 +1236,7 @@
           <w:szCs w:val="26"/>
           <w:lang w:val="en-US" w:eastAsia="pt-BR"/>
         </w:rPr>
-        <w:t xml:space="preserve">&lt;script </w:t>
-      </w:r>
-      <w:proofErr w:type="spellStart"/>
-      <w:r>
-        <w:rPr>
-          <w:rFonts w:ascii="Times New Roman" w:eastAsia="Times New Roman" w:hAnsi="Times New Roman" w:cs="Times New Roman"/>
-          <w:sz w:val="26"/>
-          <w:szCs w:val="26"/>
-          <w:lang w:val="en-US" w:eastAsia="pt-BR"/>
-        </w:rPr>
-        <w:t>src</w:t>
-      </w:r>
-      <w:proofErr w:type="spellEnd"/>
-      <w:r>
-        <w:rPr>
-          <w:rFonts w:ascii="Times New Roman" w:eastAsia="Times New Roman" w:hAnsi="Times New Roman" w:cs="Times New Roman"/>
-          <w:sz w:val="26"/>
-          <w:szCs w:val="26"/>
-          <w:lang w:val="en-US" w:eastAsia="pt-BR"/>
-        </w:rPr>
-        <w:t>="artistasData.js"&gt;&lt;/script&gt;</w:t>
+        <w:t>&lt;script src="artistasData.js"&gt;&lt;/script&gt;</w:t>
       </w:r>
     </w:p>
     <w:p>
@@ -1626,25 +1314,14 @@
         </w:rPr>
         <w:t xml:space="preserve">    </w:t>
       </w:r>
-      <w:proofErr w:type="gramStart"/>
-      <w:r>
-        <w:rPr>
-          <w:rFonts w:ascii="Times New Roman" w:eastAsia="Times New Roman" w:hAnsi="Times New Roman" w:cs="Times New Roman"/>
-          <w:sz w:val="26"/>
-          <w:szCs w:val="26"/>
-          <w:lang w:eastAsia="pt-BR"/>
-        </w:rPr>
-        <w:t>&lt;!--</w:t>
-      </w:r>
-      <w:proofErr w:type="gramEnd"/>
-      <w:r>
-        <w:rPr>
-          <w:rFonts w:ascii="Times New Roman" w:eastAsia="Times New Roman" w:hAnsi="Times New Roman" w:cs="Times New Roman"/>
-          <w:sz w:val="26"/>
-          <w:szCs w:val="26"/>
-          <w:lang w:eastAsia="pt-BR"/>
-        </w:rPr>
-        <w:t xml:space="preserve"> 2. Utilitários Reutilizáveis (Deve vir ANTES do app.js) --&gt;</w:t>
+      <w:r>
+        <w:rPr>
+          <w:rFonts w:ascii="Times New Roman" w:eastAsia="Times New Roman" w:hAnsi="Times New Roman" w:cs="Times New Roman"/>
+          <w:sz w:val="26"/>
+          <w:szCs w:val="26"/>
+          <w:lang w:eastAsia="pt-BR"/>
+        </w:rPr>
+        <w:t>&lt;!-- 2. Utilitários Reutilizáveis (Deve vir ANTES do app.js) --&gt;</w:t>
       </w:r>
     </w:p>
     <w:p>
@@ -1691,27 +1368,7 @@
           <w:szCs w:val="26"/>
           <w:lang w:val="en-US" w:eastAsia="pt-BR"/>
         </w:rPr>
-        <w:t xml:space="preserve">&lt;script </w:t>
-      </w:r>
-      <w:proofErr w:type="spellStart"/>
-      <w:r>
-        <w:rPr>
-          <w:rFonts w:ascii="Times New Roman" w:eastAsia="Times New Roman" w:hAnsi="Times New Roman" w:cs="Times New Roman"/>
-          <w:sz w:val="26"/>
-          <w:szCs w:val="26"/>
-          <w:lang w:val="en-US" w:eastAsia="pt-BR"/>
-        </w:rPr>
-        <w:t>src</w:t>
-      </w:r>
-      <w:proofErr w:type="spellEnd"/>
-      <w:r>
-        <w:rPr>
-          <w:rFonts w:ascii="Times New Roman" w:eastAsia="Times New Roman" w:hAnsi="Times New Roman" w:cs="Times New Roman"/>
-          <w:sz w:val="26"/>
-          <w:szCs w:val="26"/>
-          <w:lang w:val="en-US" w:eastAsia="pt-BR"/>
-        </w:rPr>
-        <w:t>="utils.js"&gt;&lt;/script&gt;</w:t>
+        <w:t>&lt;script src="utils.js"&gt;&lt;/script&gt;</w:t>
       </w:r>
     </w:p>
     <w:p>
@@ -1789,25 +1446,14 @@
         </w:rPr>
         <w:t xml:space="preserve">    </w:t>
       </w:r>
-      <w:proofErr w:type="gramStart"/>
-      <w:r>
-        <w:rPr>
-          <w:rFonts w:ascii="Times New Roman" w:eastAsia="Times New Roman" w:hAnsi="Times New Roman" w:cs="Times New Roman"/>
-          <w:sz w:val="26"/>
-          <w:szCs w:val="26"/>
-          <w:lang w:eastAsia="pt-BR"/>
-        </w:rPr>
-        <w:t>&lt;!--</w:t>
-      </w:r>
-      <w:proofErr w:type="gramEnd"/>
-      <w:r>
-        <w:rPr>
-          <w:rFonts w:ascii="Times New Roman" w:eastAsia="Times New Roman" w:hAnsi="Times New Roman" w:cs="Times New Roman"/>
-          <w:sz w:val="26"/>
-          <w:szCs w:val="26"/>
-          <w:lang w:eastAsia="pt-BR"/>
-        </w:rPr>
-        <w:t xml:space="preserve"> 3. Lógica Específica da Aplicação --&gt;</w:t>
+      <w:r>
+        <w:rPr>
+          <w:rFonts w:ascii="Times New Roman" w:eastAsia="Times New Roman" w:hAnsi="Times New Roman" w:cs="Times New Roman"/>
+          <w:sz w:val="26"/>
+          <w:szCs w:val="26"/>
+          <w:lang w:eastAsia="pt-BR"/>
+        </w:rPr>
+        <w:t>&lt;!-- 3. Lógica Específica da Aplicação --&gt;</w:t>
       </w:r>
     </w:p>
     <w:p>
@@ -1845,27 +1491,7 @@
           <w:szCs w:val="26"/>
           <w:lang w:eastAsia="pt-BR"/>
         </w:rPr>
-        <w:t xml:space="preserve">    &lt;script </w:t>
-      </w:r>
-      <w:proofErr w:type="spellStart"/>
-      <w:r>
-        <w:rPr>
-          <w:rFonts w:ascii="Times New Roman" w:eastAsia="Times New Roman" w:hAnsi="Times New Roman" w:cs="Times New Roman"/>
-          <w:sz w:val="26"/>
-          <w:szCs w:val="26"/>
-          <w:lang w:eastAsia="pt-BR"/>
-        </w:rPr>
-        <w:t>src</w:t>
-      </w:r>
-      <w:proofErr w:type="spellEnd"/>
-      <w:r>
-        <w:rPr>
-          <w:rFonts w:ascii="Times New Roman" w:eastAsia="Times New Roman" w:hAnsi="Times New Roman" w:cs="Times New Roman"/>
-          <w:sz w:val="26"/>
-          <w:szCs w:val="26"/>
-          <w:lang w:eastAsia="pt-BR"/>
-        </w:rPr>
-        <w:t>="app.js"&gt;&lt;/script&gt;</w:t>
+        <w:t xml:space="preserve">    &lt;script src="app.js"&gt;&lt;/script&gt;</w:t>
       </w:r>
     </w:p>
     <w:p>
@@ -1941,27 +1567,7 @@
           <w:szCs w:val="26"/>
           <w:lang w:eastAsia="pt-BR"/>
         </w:rPr>
-        <w:t>&lt;/</w:t>
-      </w:r>
-      <w:proofErr w:type="spellStart"/>
-      <w:r>
-        <w:rPr>
-          <w:rFonts w:ascii="Times New Roman" w:eastAsia="Times New Roman" w:hAnsi="Times New Roman" w:cs="Times New Roman"/>
-          <w:sz w:val="26"/>
-          <w:szCs w:val="26"/>
-          <w:lang w:eastAsia="pt-BR"/>
-        </w:rPr>
-        <w:t>html</w:t>
-      </w:r>
-      <w:proofErr w:type="spellEnd"/>
-      <w:r>
-        <w:rPr>
-          <w:rFonts w:ascii="Times New Roman" w:eastAsia="Times New Roman" w:hAnsi="Times New Roman" w:cs="Times New Roman"/>
-          <w:sz w:val="26"/>
-          <w:szCs w:val="26"/>
-          <w:lang w:eastAsia="pt-BR"/>
-        </w:rPr>
-        <w:t>&gt;</w:t>
+        <w:t>&lt;/html&gt;</w:t>
       </w:r>
     </w:p>
     <w:p/>

</xml_diff>

<commit_message>
Ajuste nos arquivos do desafio checkpoint 1
</commit_message>
<xml_diff>
--- a/checkpoint 1/ADENDO TÉCNICO DE ARQUITETURA.docx
+++ b/checkpoint 1/ADENDO TÉCNICO DE ARQUITETURA.docx
@@ -5,13 +5,32 @@
     <w:p>
       <w:pPr>
         <w:spacing w:before="100" w:beforeAutospacing="1" w:after="100" w:afterAutospacing="1" w:line="240" w:lineRule="auto"/>
-        <w:outlineLvl w:val="2"/>
+        <w:rPr>
+          <w:rFonts w:ascii="Times New Roman" w:eastAsia="Times New Roman" w:hAnsi="Times New Roman" w:cs="Times New Roman"/>
+          <w:sz w:val="26"/>
+          <w:szCs w:val="26"/>
+          <w:lang w:eastAsia="pt-BR"/>
+        </w:rPr>
+      </w:pPr>
+      <w:r>
         <w:rPr>
           <w:rFonts w:ascii="Times New Roman" w:eastAsia="Times New Roman" w:hAnsi="Times New Roman" w:cs="Times New Roman"/>
           <w:b/>
           <w:bCs/>
-          <w:sz w:val="27"/>
-          <w:szCs w:val="27"/>
+          <w:sz w:val="26"/>
+          <w:szCs w:val="26"/>
+          <w:lang w:eastAsia="pt-BR"/>
+        </w:rPr>
+        <w:t>ADENDO TÉCNICO DE ARQUITETURA – TICKET RF-043</w:t>
+      </w:r>
+    </w:p>
+    <w:p>
+      <w:pPr>
+        <w:spacing w:before="100" w:beforeAutospacing="1" w:after="100" w:afterAutospacing="1" w:line="240" w:lineRule="auto"/>
+        <w:rPr>
+          <w:rFonts w:ascii="Times New Roman" w:eastAsia="Times New Roman" w:hAnsi="Times New Roman" w:cs="Times New Roman"/>
+          <w:sz w:val="26"/>
+          <w:szCs w:val="26"/>
           <w:lang w:eastAsia="pt-BR"/>
         </w:rPr>
       </w:pPr>
@@ -20,11 +39,20 @@
           <w:rFonts w:ascii="Times New Roman" w:eastAsia="Times New Roman" w:hAnsi="Times New Roman" w:cs="Times New Roman"/>
           <w:b/>
           <w:bCs/>
-          <w:sz w:val="27"/>
-          <w:szCs w:val="27"/>
-          <w:lang w:eastAsia="pt-BR"/>
-        </w:rPr>
-        <w:t>ADENDO TÉCNICO DE ARQUITETURA – TICKET RF-043</w:t>
+          <w:sz w:val="26"/>
+          <w:szCs w:val="26"/>
+          <w:lang w:eastAsia="pt-BR"/>
+        </w:rPr>
+        <w:t>De:</w:t>
+      </w:r>
+      <w:r>
+        <w:rPr>
+          <w:rFonts w:ascii="Times New Roman" w:eastAsia="Times New Roman" w:hAnsi="Times New Roman" w:cs="Times New Roman"/>
+          <w:sz w:val="26"/>
+          <w:szCs w:val="26"/>
+          <w:lang w:eastAsia="pt-BR"/>
+        </w:rPr>
+        <w:t xml:space="preserve"> Equipe de Arquitetura de Software &amp; QA</w:t>
       </w:r>
     </w:p>
     <w:p>
@@ -46,16 +74,76 @@
           <w:szCs w:val="26"/>
           <w:lang w:eastAsia="pt-BR"/>
         </w:rPr>
-        <w:t>De:</w:t>
-      </w:r>
-      <w:r>
-        <w:rPr>
-          <w:rFonts w:ascii="Times New Roman" w:eastAsia="Times New Roman" w:hAnsi="Times New Roman" w:cs="Times New Roman"/>
-          <w:sz w:val="26"/>
-          <w:szCs w:val="26"/>
-          <w:lang w:eastAsia="pt-BR"/>
-        </w:rPr>
-        <w:t xml:space="preserve"> Equipe de Arquitetura de Software &amp; QA</w:t>
+        <w:t>Tipo:</w:t>
+      </w:r>
+      <w:r>
+        <w:rPr>
+          <w:rFonts w:ascii="Times New Roman" w:eastAsia="Times New Roman" w:hAnsi="Times New Roman" w:cs="Times New Roman"/>
+          <w:sz w:val="26"/>
+          <w:szCs w:val="26"/>
+          <w:lang w:eastAsia="pt-BR"/>
+        </w:rPr>
+        <w:t xml:space="preserve"> </w:t>
+      </w:r>
+      <w:proofErr w:type="spellStart"/>
+      <w:r>
+        <w:rPr>
+          <w:rFonts w:ascii="Times New Roman" w:eastAsia="Times New Roman" w:hAnsi="Times New Roman" w:cs="Times New Roman"/>
+          <w:sz w:val="26"/>
+          <w:szCs w:val="26"/>
+          <w:lang w:eastAsia="pt-BR"/>
+        </w:rPr>
+        <w:t>Refatoração</w:t>
+      </w:r>
+      <w:proofErr w:type="spellEnd"/>
+      <w:r>
+        <w:rPr>
+          <w:rFonts w:ascii="Times New Roman" w:eastAsia="Times New Roman" w:hAnsi="Times New Roman" w:cs="Times New Roman"/>
+          <w:sz w:val="26"/>
+          <w:szCs w:val="26"/>
+          <w:lang w:eastAsia="pt-BR"/>
+        </w:rPr>
+        <w:t>, Modularização e Organização de Diretórios (</w:t>
+      </w:r>
+      <w:proofErr w:type="spellStart"/>
+      <w:r>
+        <w:rPr>
+          <w:rFonts w:ascii="Times New Roman" w:eastAsia="Times New Roman" w:hAnsi="Times New Roman" w:cs="Times New Roman"/>
+          <w:sz w:val="26"/>
+          <w:szCs w:val="26"/>
+          <w:lang w:eastAsia="pt-BR"/>
+        </w:rPr>
+        <w:t>Code</w:t>
+      </w:r>
+      <w:proofErr w:type="spellEnd"/>
+      <w:r>
+        <w:rPr>
+          <w:rFonts w:ascii="Times New Roman" w:eastAsia="Times New Roman" w:hAnsi="Times New Roman" w:cs="Times New Roman"/>
+          <w:sz w:val="26"/>
+          <w:szCs w:val="26"/>
+          <w:lang w:eastAsia="pt-BR"/>
+        </w:rPr>
+        <w:t xml:space="preserve"> </w:t>
+      </w:r>
+      <w:proofErr w:type="spellStart"/>
+      <w:r>
+        <w:rPr>
+          <w:rFonts w:ascii="Times New Roman" w:eastAsia="Times New Roman" w:hAnsi="Times New Roman" w:cs="Times New Roman"/>
+          <w:sz w:val="26"/>
+          <w:szCs w:val="26"/>
+          <w:lang w:eastAsia="pt-BR"/>
+        </w:rPr>
+        <w:t>Refactoring</w:t>
+      </w:r>
+      <w:proofErr w:type="spellEnd"/>
+      <w:r>
+        <w:rPr>
+          <w:rFonts w:ascii="Times New Roman" w:eastAsia="Times New Roman" w:hAnsi="Times New Roman" w:cs="Times New Roman"/>
+          <w:sz w:val="26"/>
+          <w:szCs w:val="26"/>
+          <w:lang w:eastAsia="pt-BR"/>
+        </w:rPr>
+        <w:t>)</w:t>
       </w:r>
     </w:p>
     <w:p>
@@ -77,16 +165,16 @@
           <w:szCs w:val="26"/>
           <w:lang w:eastAsia="pt-BR"/>
         </w:rPr>
-        <w:t>Tipo:</w:t>
-      </w:r>
-      <w:r>
-        <w:rPr>
-          <w:rFonts w:ascii="Times New Roman" w:eastAsia="Times New Roman" w:hAnsi="Times New Roman" w:cs="Times New Roman"/>
-          <w:sz w:val="26"/>
-          <w:szCs w:val="26"/>
-          <w:lang w:eastAsia="pt-BR"/>
-        </w:rPr>
-        <w:t xml:space="preserve"> Refatoração e Modurarização de Código (Code Refactoring)</w:t>
+        <w:t>Assunto:</w:t>
+      </w:r>
+      <w:r>
+        <w:rPr>
+          <w:rFonts w:ascii="Times New Roman" w:eastAsia="Times New Roman" w:hAnsi="Times New Roman" w:cs="Times New Roman"/>
+          <w:sz w:val="26"/>
+          <w:szCs w:val="26"/>
+          <w:lang w:eastAsia="pt-BR"/>
+        </w:rPr>
+        <w:t xml:space="preserve"> Organização de Pastas, Módulos Reutilizáveis vs. Regras de Negócio Específicas</w:t>
       </w:r>
     </w:p>
     <w:p>
@@ -108,22 +196,44 @@
           <w:szCs w:val="26"/>
           <w:lang w:eastAsia="pt-BR"/>
         </w:rPr>
-        <w:t>Assunto:</w:t>
-      </w:r>
-      <w:r>
-        <w:rPr>
-          <w:rFonts w:ascii="Times New Roman" w:eastAsia="Times New Roman" w:hAnsi="Times New Roman" w:cs="Times New Roman"/>
-          <w:sz w:val="26"/>
-          <w:szCs w:val="26"/>
-          <w:lang w:eastAsia="pt-BR"/>
-        </w:rPr>
-        <w:t xml:space="preserve"> Separação de Módulos Reutilizáveis vs. Regras de Negócio Específicas</w:t>
+        <w:t>1. Motivação da Mudança</w:t>
       </w:r>
     </w:p>
     <w:p>
       <w:pPr>
         <w:spacing w:before="100" w:beforeAutospacing="1" w:after="100" w:afterAutospacing="1" w:line="240" w:lineRule="auto"/>
-        <w:outlineLvl w:val="3"/>
+        <w:rPr>
+          <w:rFonts w:ascii="Times New Roman" w:eastAsia="Times New Roman" w:hAnsi="Times New Roman" w:cs="Times New Roman"/>
+          <w:sz w:val="26"/>
+          <w:szCs w:val="26"/>
+          <w:lang w:eastAsia="pt-BR"/>
+        </w:rPr>
+      </w:pPr>
+      <w:r>
+        <w:rPr>
+          <w:rFonts w:ascii="Times New Roman" w:eastAsia="Times New Roman" w:hAnsi="Times New Roman" w:cs="Times New Roman"/>
+          <w:sz w:val="26"/>
+          <w:szCs w:val="26"/>
+          <w:lang w:eastAsia="pt-BR"/>
+        </w:rPr>
+        <w:t>A equipe de Qualidade identificou duas falhas de arquitetura na versão inicial:</w:t>
+      </w:r>
+    </w:p>
+    <w:p>
+      <w:pPr>
+        <w:numPr>
+          <w:ilvl w:val="0"/>
+          <w:numId w:val="1"/>
+        </w:numPr>
+        <w:spacing w:before="100" w:beforeAutospacing="1" w:after="100" w:afterAutospacing="1" w:line="240" w:lineRule="auto"/>
+        <w:rPr>
+          <w:rFonts w:ascii="Times New Roman" w:eastAsia="Times New Roman" w:hAnsi="Times New Roman" w:cs="Times New Roman"/>
+          <w:sz w:val="26"/>
+          <w:szCs w:val="26"/>
+          <w:lang w:eastAsia="pt-BR"/>
+        </w:rPr>
+      </w:pPr>
+      <w:r>
         <w:rPr>
           <w:rFonts w:ascii="Times New Roman" w:eastAsia="Times New Roman" w:hAnsi="Times New Roman" w:cs="Times New Roman"/>
           <w:b/>
@@ -132,6 +242,31 @@
           <w:szCs w:val="26"/>
           <w:lang w:eastAsia="pt-BR"/>
         </w:rPr>
+        <w:t>Falta de Padronização de Pastas:</w:t>
+      </w:r>
+      <w:r>
+        <w:rPr>
+          <w:rFonts w:ascii="Times New Roman" w:eastAsia="Times New Roman" w:hAnsi="Times New Roman" w:cs="Times New Roman"/>
+          <w:sz w:val="26"/>
+          <w:szCs w:val="26"/>
+          <w:lang w:eastAsia="pt-BR"/>
+        </w:rPr>
+        <w:t xml:space="preserve"> Arquivos de estilo e scripts estavam soltos na raiz do projeto.</w:t>
+      </w:r>
+    </w:p>
+    <w:p>
+      <w:pPr>
+        <w:numPr>
+          <w:ilvl w:val="0"/>
+          <w:numId w:val="1"/>
+        </w:numPr>
+        <w:spacing w:before="100" w:beforeAutospacing="1" w:after="100" w:afterAutospacing="1" w:line="240" w:lineRule="auto"/>
+        <w:rPr>
+          <w:rFonts w:ascii="Times New Roman" w:eastAsia="Times New Roman" w:hAnsi="Times New Roman" w:cs="Times New Roman"/>
+          <w:sz w:val="26"/>
+          <w:szCs w:val="26"/>
+          <w:lang w:eastAsia="pt-BR"/>
+        </w:rPr>
       </w:pPr>
       <w:r>
         <w:rPr>
@@ -142,7 +277,16 @@
           <w:szCs w:val="26"/>
           <w:lang w:eastAsia="pt-BR"/>
         </w:rPr>
-        <w:t>1. Motivação da Mudança</w:t>
+        <w:t>Acoplamento de Código:</w:t>
+      </w:r>
+      <w:r>
+        <w:rPr>
+          <w:rFonts w:ascii="Times New Roman" w:eastAsia="Times New Roman" w:hAnsi="Times New Roman" w:cs="Times New Roman"/>
+          <w:sz w:val="26"/>
+          <w:szCs w:val="26"/>
+          <w:lang w:eastAsia="pt-BR"/>
+        </w:rPr>
+        <w:t xml:space="preserve"> Funções genéricas (validação de CPF e exportação de arquivo TXT) estavam misturadas com a lógica exclusiva do formulário do Rock in Rio.</w:t>
       </w:r>
     </w:p>
     <w:p>
@@ -162,7 +306,87 @@
           <w:szCs w:val="26"/>
           <w:lang w:eastAsia="pt-BR"/>
         </w:rPr>
-        <w:t>A equipe de Qualidade identificou que funções genéricas de validação e utilitários (como a validação matemática de CPF e funções de exportação de arquivos) estavam misturadas com a lógica exclusiva do formulário do Rock in Rio.</w:t>
+        <w:t>Para garantir escalabilidade, o aluno deverá organizar o projeto em diretórios (</w:t>
+      </w:r>
+      <w:proofErr w:type="spellStart"/>
+      <w:r>
+        <w:rPr>
+          <w:rFonts w:ascii="Times New Roman" w:eastAsia="Times New Roman" w:hAnsi="Times New Roman" w:cs="Times New Roman"/>
+          <w:sz w:val="26"/>
+          <w:szCs w:val="26"/>
+          <w:lang w:eastAsia="pt-BR"/>
+        </w:rPr>
+        <w:t>css</w:t>
+      </w:r>
+      <w:proofErr w:type="spellEnd"/>
+      <w:r>
+        <w:rPr>
+          <w:rFonts w:ascii="Times New Roman" w:eastAsia="Times New Roman" w:hAnsi="Times New Roman" w:cs="Times New Roman"/>
+          <w:sz w:val="26"/>
+          <w:szCs w:val="26"/>
+          <w:lang w:eastAsia="pt-BR"/>
+        </w:rPr>
+        <w:t xml:space="preserve">/ e </w:t>
+      </w:r>
+      <w:proofErr w:type="spellStart"/>
+      <w:r>
+        <w:rPr>
+          <w:rFonts w:ascii="Times New Roman" w:eastAsia="Times New Roman" w:hAnsi="Times New Roman" w:cs="Times New Roman"/>
+          <w:sz w:val="26"/>
+          <w:szCs w:val="26"/>
+          <w:lang w:eastAsia="pt-BR"/>
+        </w:rPr>
+        <w:t>js</w:t>
+      </w:r>
+      <w:proofErr w:type="spellEnd"/>
+      <w:r>
+        <w:rPr>
+          <w:rFonts w:ascii="Times New Roman" w:eastAsia="Times New Roman" w:hAnsi="Times New Roman" w:cs="Times New Roman"/>
+          <w:sz w:val="26"/>
+          <w:szCs w:val="26"/>
+          <w:lang w:eastAsia="pt-BR"/>
+        </w:rPr>
+        <w:t xml:space="preserve">/) e </w:t>
+      </w:r>
+      <w:proofErr w:type="spellStart"/>
+      <w:r>
+        <w:rPr>
+          <w:rFonts w:ascii="Times New Roman" w:eastAsia="Times New Roman" w:hAnsi="Times New Roman" w:cs="Times New Roman"/>
+          <w:sz w:val="26"/>
+          <w:szCs w:val="26"/>
+          <w:lang w:eastAsia="pt-BR"/>
+        </w:rPr>
+        <w:t>refatorar</w:t>
+      </w:r>
+      <w:proofErr w:type="spellEnd"/>
+      <w:r>
+        <w:rPr>
+          <w:rFonts w:ascii="Times New Roman" w:eastAsia="Times New Roman" w:hAnsi="Times New Roman" w:cs="Times New Roman"/>
+          <w:sz w:val="26"/>
+          <w:szCs w:val="26"/>
+          <w:lang w:eastAsia="pt-BR"/>
+        </w:rPr>
+        <w:t xml:space="preserve"> o </w:t>
+      </w:r>
+      <w:proofErr w:type="spellStart"/>
+      <w:r>
+        <w:rPr>
+          <w:rFonts w:ascii="Times New Roman" w:eastAsia="Times New Roman" w:hAnsi="Times New Roman" w:cs="Times New Roman"/>
+          <w:sz w:val="26"/>
+          <w:szCs w:val="26"/>
+          <w:lang w:eastAsia="pt-BR"/>
+        </w:rPr>
+        <w:t>JavaScript</w:t>
+      </w:r>
+      <w:proofErr w:type="spellEnd"/>
+      <w:r>
+        <w:rPr>
+          <w:rFonts w:ascii="Times New Roman" w:eastAsia="Times New Roman" w:hAnsi="Times New Roman" w:cs="Times New Roman"/>
+          <w:sz w:val="26"/>
+          <w:szCs w:val="26"/>
+          <w:lang w:eastAsia="pt-BR"/>
+        </w:rPr>
+        <w:t xml:space="preserve"> separando as responsabilidades em arquivos distintos.</w:t>
       </w:r>
     </w:p>
     <w:p>
@@ -175,15 +399,6 @@
           <w:lang w:eastAsia="pt-BR"/>
         </w:rPr>
       </w:pPr>
-      <w:r>
-        <w:rPr>
-          <w:rFonts w:ascii="Times New Roman" w:eastAsia="Times New Roman" w:hAnsi="Times New Roman" w:cs="Times New Roman"/>
-          <w:sz w:val="26"/>
-          <w:szCs w:val="26"/>
-          <w:lang w:eastAsia="pt-BR"/>
-        </w:rPr>
-        <w:t xml:space="preserve">Para permitir que a empresa utilize as mesmas validações em </w:t>
-      </w:r>
       <w:r>
         <w:rPr>
           <w:rFonts w:ascii="Times New Roman" w:eastAsia="Times New Roman" w:hAnsi="Times New Roman" w:cs="Times New Roman"/>
@@ -193,81 +408,27 @@
           <w:szCs w:val="26"/>
           <w:lang w:eastAsia="pt-BR"/>
         </w:rPr>
-        <w:t>outros formulários futuros</w:t>
-      </w:r>
-      <w:r>
-        <w:rPr>
-          <w:rFonts w:ascii="Times New Roman" w:eastAsia="Times New Roman" w:hAnsi="Times New Roman" w:cs="Times New Roman"/>
-          <w:sz w:val="26"/>
-          <w:szCs w:val="26"/>
-          <w:lang w:eastAsia="pt-BR"/>
-        </w:rPr>
-        <w:t xml:space="preserve"> (como cadastro de clientes e ingressos para outros eventos), o aluno deverá </w:t>
-      </w:r>
-      <w:r>
-        <w:rPr>
-          <w:rFonts w:ascii="Times New Roman" w:eastAsia="Times New Roman" w:hAnsi="Times New Roman" w:cs="Times New Roman"/>
-          <w:b/>
-          <w:bCs/>
-          <w:sz w:val="26"/>
-          <w:szCs w:val="26"/>
-          <w:lang w:eastAsia="pt-BR"/>
-        </w:rPr>
-        <w:t>refatorar o código dividindo o JavaScript em 2 arquivos separados</w:t>
-      </w:r>
-      <w:r>
-        <w:rPr>
-          <w:rFonts w:ascii="Times New Roman" w:eastAsia="Times New Roman" w:hAnsi="Times New Roman" w:cs="Times New Roman"/>
-          <w:sz w:val="26"/>
-          <w:szCs w:val="26"/>
-          <w:lang w:eastAsia="pt-BR"/>
-        </w:rPr>
-        <w:t>.</w:t>
+        <w:t>2. Estrutura Física e Divisão de Responsabilidades</w:t>
       </w:r>
     </w:p>
     <w:p>
       <w:pPr>
         <w:spacing w:before="100" w:beforeAutospacing="1" w:after="100" w:afterAutospacing="1" w:line="240" w:lineRule="auto"/>
-        <w:outlineLvl w:val="3"/>
-        <w:rPr>
-          <w:rFonts w:ascii="Times New Roman" w:eastAsia="Times New Roman" w:hAnsi="Times New Roman" w:cs="Times New Roman"/>
-          <w:b/>
-          <w:bCs/>
-          <w:sz w:val="26"/>
-          <w:szCs w:val="26"/>
-          <w:lang w:eastAsia="pt-BR"/>
-        </w:rPr>
-      </w:pPr>
-      <w:r>
-        <w:rPr>
-          <w:rFonts w:ascii="Times New Roman" w:eastAsia="Times New Roman" w:hAnsi="Times New Roman" w:cs="Times New Roman"/>
-          <w:b/>
-          <w:bCs/>
-          <w:sz w:val="26"/>
-          <w:szCs w:val="26"/>
-          <w:lang w:eastAsia="pt-BR"/>
-        </w:rPr>
-        <w:t>2. Divisão de Responsabilidades dos Arquivos</w:t>
-      </w:r>
-    </w:p>
-    <w:p>
-      <w:pPr>
-        <w:spacing w:before="100" w:beforeAutospacing="1" w:after="100" w:afterAutospacing="1" w:line="240" w:lineRule="auto"/>
-        <w:rPr>
-          <w:rFonts w:ascii="Times New Roman" w:eastAsia="Times New Roman" w:hAnsi="Times New Roman" w:cs="Times New Roman"/>
-          <w:sz w:val="26"/>
-          <w:szCs w:val="26"/>
-          <w:lang w:eastAsia="pt-BR"/>
-        </w:rPr>
-      </w:pPr>
-      <w:r>
-        <w:rPr>
-          <w:rFonts w:ascii="Times New Roman" w:eastAsia="Times New Roman" w:hAnsi="Times New Roman" w:cs="Times New Roman"/>
-          <w:sz w:val="26"/>
-          <w:szCs w:val="26"/>
-          <w:lang w:eastAsia="pt-BR"/>
-        </w:rPr>
-        <w:t>Os alunos deverão organizar os scripts na seguinte estrutura:</w:t>
+        <w:rPr>
+          <w:rFonts w:ascii="Times New Roman" w:eastAsia="Times New Roman" w:hAnsi="Times New Roman" w:cs="Times New Roman"/>
+          <w:sz w:val="26"/>
+          <w:szCs w:val="26"/>
+          <w:lang w:eastAsia="pt-BR"/>
+        </w:rPr>
+      </w:pPr>
+      <w:r>
+        <w:rPr>
+          <w:rFonts w:ascii="Times New Roman" w:eastAsia="Times New Roman" w:hAnsi="Times New Roman" w:cs="Times New Roman"/>
+          <w:sz w:val="26"/>
+          <w:szCs w:val="26"/>
+          <w:lang w:eastAsia="pt-BR"/>
+        </w:rPr>
+        <w:t>O projeto deve ser organizado na seguinte estrutura de pastas:</w:t>
       </w:r>
     </w:p>
     <w:p>
@@ -280,6 +441,7 @@
           <w:lang w:eastAsia="pt-BR"/>
         </w:rPr>
       </w:pPr>
+      <w:proofErr w:type="spellStart"/>
       <w:r>
         <w:rPr>
           <w:rFonts w:ascii="Times New Roman" w:eastAsia="Times New Roman" w:hAnsi="Times New Roman" w:cs="Times New Roman"/>
@@ -289,6 +451,7 @@
         </w:rPr>
         <w:t>Plaintext</w:t>
       </w:r>
+      <w:proofErr w:type="spellEnd"/>
     </w:p>
     <w:p>
       <w:pPr>
@@ -325,7 +488,7 @@
           <w:szCs w:val="26"/>
           <w:lang w:eastAsia="pt-BR"/>
         </w:rPr>
-        <w:t>/js</w:t>
+        <w:t>/modelo com qualidade</w:t>
       </w:r>
     </w:p>
     <w:p>
@@ -363,7 +526,27 @@
           <w:szCs w:val="26"/>
           <w:lang w:eastAsia="pt-BR"/>
         </w:rPr>
-        <w:t xml:space="preserve">  ├── utils.js  &lt;-- (Módulo Genérico / Reutilizável)</w:t>
+        <w:t xml:space="preserve">├── </w:t>
+      </w:r>
+      <w:proofErr w:type="spellStart"/>
+      <w:r>
+        <w:rPr>
+          <w:rFonts w:ascii="Times New Roman" w:eastAsia="Times New Roman" w:hAnsi="Times New Roman" w:cs="Times New Roman"/>
+          <w:sz w:val="26"/>
+          <w:szCs w:val="26"/>
+          <w:lang w:eastAsia="pt-BR"/>
+        </w:rPr>
+        <w:t>css</w:t>
+      </w:r>
+      <w:proofErr w:type="spellEnd"/>
+      <w:r>
+        <w:rPr>
+          <w:rFonts w:ascii="Times New Roman" w:eastAsia="Times New Roman" w:hAnsi="Times New Roman" w:cs="Times New Roman"/>
+          <w:sz w:val="26"/>
+          <w:szCs w:val="26"/>
+          <w:lang w:eastAsia="pt-BR"/>
+        </w:rPr>
+        <w:t>/</w:t>
       </w:r>
     </w:p>
     <w:p>
@@ -401,7 +584,7 @@
           <w:szCs w:val="26"/>
           <w:lang w:eastAsia="pt-BR"/>
         </w:rPr>
-        <w:t xml:space="preserve">  └── app.js    &lt;-- (Módulo Específico / Regra do Evento)</w:t>
+        <w:t>│   └── style.css</w:t>
       </w:r>
     </w:p>
     <w:p>
@@ -432,6 +615,236 @@
           <w:lang w:eastAsia="pt-BR"/>
         </w:rPr>
       </w:pPr>
+      <w:r>
+        <w:rPr>
+          <w:rFonts w:ascii="Times New Roman" w:eastAsia="Times New Roman" w:hAnsi="Times New Roman" w:cs="Times New Roman"/>
+          <w:sz w:val="26"/>
+          <w:szCs w:val="26"/>
+          <w:lang w:eastAsia="pt-BR"/>
+        </w:rPr>
+        <w:t xml:space="preserve">├── </w:t>
+      </w:r>
+      <w:proofErr w:type="spellStart"/>
+      <w:r>
+        <w:rPr>
+          <w:rFonts w:ascii="Times New Roman" w:eastAsia="Times New Roman" w:hAnsi="Times New Roman" w:cs="Times New Roman"/>
+          <w:sz w:val="26"/>
+          <w:szCs w:val="26"/>
+          <w:lang w:eastAsia="pt-BR"/>
+        </w:rPr>
+        <w:t>js</w:t>
+      </w:r>
+      <w:proofErr w:type="spellEnd"/>
+      <w:r>
+        <w:rPr>
+          <w:rFonts w:ascii="Times New Roman" w:eastAsia="Times New Roman" w:hAnsi="Times New Roman" w:cs="Times New Roman"/>
+          <w:sz w:val="26"/>
+          <w:szCs w:val="26"/>
+          <w:lang w:eastAsia="pt-BR"/>
+        </w:rPr>
+        <w:t>/</w:t>
+      </w:r>
+    </w:p>
+    <w:p>
+      <w:pPr>
+        <w:tabs>
+          <w:tab w:val="left" w:pos="916"/>
+          <w:tab w:val="left" w:pos="1832"/>
+          <w:tab w:val="left" w:pos="2748"/>
+          <w:tab w:val="left" w:pos="3664"/>
+          <w:tab w:val="left" w:pos="4580"/>
+          <w:tab w:val="left" w:pos="5496"/>
+          <w:tab w:val="left" w:pos="6412"/>
+          <w:tab w:val="left" w:pos="7328"/>
+          <w:tab w:val="left" w:pos="8244"/>
+          <w:tab w:val="left" w:pos="9160"/>
+          <w:tab w:val="left" w:pos="10076"/>
+          <w:tab w:val="left" w:pos="10992"/>
+          <w:tab w:val="left" w:pos="11908"/>
+          <w:tab w:val="left" w:pos="12824"/>
+          <w:tab w:val="left" w:pos="13740"/>
+          <w:tab w:val="left" w:pos="14656"/>
+        </w:tabs>
+        <w:spacing w:after="0" w:line="240" w:lineRule="auto"/>
+        <w:rPr>
+          <w:rFonts w:ascii="Times New Roman" w:eastAsia="Times New Roman" w:hAnsi="Times New Roman" w:cs="Times New Roman"/>
+          <w:sz w:val="26"/>
+          <w:szCs w:val="26"/>
+          <w:lang w:eastAsia="pt-BR"/>
+        </w:rPr>
+      </w:pPr>
+      <w:r>
+        <w:rPr>
+          <w:rFonts w:ascii="Times New Roman" w:eastAsia="Times New Roman" w:hAnsi="Times New Roman" w:cs="Times New Roman"/>
+          <w:sz w:val="26"/>
+          <w:szCs w:val="26"/>
+          <w:lang w:eastAsia="pt-BR"/>
+        </w:rPr>
+        <w:t xml:space="preserve">│   ├── </w:t>
+      </w:r>
+      <w:proofErr w:type="gramStart"/>
+      <w:r>
+        <w:rPr>
+          <w:rFonts w:ascii="Times New Roman" w:eastAsia="Times New Roman" w:hAnsi="Times New Roman" w:cs="Times New Roman"/>
+          <w:sz w:val="26"/>
+          <w:szCs w:val="26"/>
+          <w:lang w:eastAsia="pt-BR"/>
+        </w:rPr>
+        <w:t>artistasData.js  &lt;</w:t>
+      </w:r>
+      <w:proofErr w:type="gramEnd"/>
+      <w:r>
+        <w:rPr>
+          <w:rFonts w:ascii="Times New Roman" w:eastAsia="Times New Roman" w:hAnsi="Times New Roman" w:cs="Times New Roman"/>
+          <w:sz w:val="26"/>
+          <w:szCs w:val="26"/>
+          <w:lang w:eastAsia="pt-BR"/>
+        </w:rPr>
+        <w:t>-- (Massa de Dados)</w:t>
+      </w:r>
+    </w:p>
+    <w:p>
+      <w:pPr>
+        <w:tabs>
+          <w:tab w:val="left" w:pos="916"/>
+          <w:tab w:val="left" w:pos="1832"/>
+          <w:tab w:val="left" w:pos="2748"/>
+          <w:tab w:val="left" w:pos="3664"/>
+          <w:tab w:val="left" w:pos="4580"/>
+          <w:tab w:val="left" w:pos="5496"/>
+          <w:tab w:val="left" w:pos="6412"/>
+          <w:tab w:val="left" w:pos="7328"/>
+          <w:tab w:val="left" w:pos="8244"/>
+          <w:tab w:val="left" w:pos="9160"/>
+          <w:tab w:val="left" w:pos="10076"/>
+          <w:tab w:val="left" w:pos="10992"/>
+          <w:tab w:val="left" w:pos="11908"/>
+          <w:tab w:val="left" w:pos="12824"/>
+          <w:tab w:val="left" w:pos="13740"/>
+          <w:tab w:val="left" w:pos="14656"/>
+        </w:tabs>
+        <w:spacing w:after="0" w:line="240" w:lineRule="auto"/>
+        <w:rPr>
+          <w:rFonts w:ascii="Times New Roman" w:eastAsia="Times New Roman" w:hAnsi="Times New Roman" w:cs="Times New Roman"/>
+          <w:sz w:val="26"/>
+          <w:szCs w:val="26"/>
+          <w:lang w:eastAsia="pt-BR"/>
+        </w:rPr>
+      </w:pPr>
+      <w:r>
+        <w:rPr>
+          <w:rFonts w:ascii="Times New Roman" w:eastAsia="Times New Roman" w:hAnsi="Times New Roman" w:cs="Times New Roman"/>
+          <w:sz w:val="26"/>
+          <w:szCs w:val="26"/>
+          <w:lang w:eastAsia="pt-BR"/>
+        </w:rPr>
+        <w:t>│   ├── utils.js         &lt;-- (Módulo Genérico / Reutilizável)</w:t>
+      </w:r>
+    </w:p>
+    <w:p>
+      <w:pPr>
+        <w:tabs>
+          <w:tab w:val="left" w:pos="916"/>
+          <w:tab w:val="left" w:pos="1832"/>
+          <w:tab w:val="left" w:pos="2748"/>
+          <w:tab w:val="left" w:pos="3664"/>
+          <w:tab w:val="left" w:pos="4580"/>
+          <w:tab w:val="left" w:pos="5496"/>
+          <w:tab w:val="left" w:pos="6412"/>
+          <w:tab w:val="left" w:pos="7328"/>
+          <w:tab w:val="left" w:pos="8244"/>
+          <w:tab w:val="left" w:pos="9160"/>
+          <w:tab w:val="left" w:pos="10076"/>
+          <w:tab w:val="left" w:pos="10992"/>
+          <w:tab w:val="left" w:pos="11908"/>
+          <w:tab w:val="left" w:pos="12824"/>
+          <w:tab w:val="left" w:pos="13740"/>
+          <w:tab w:val="left" w:pos="14656"/>
+        </w:tabs>
+        <w:spacing w:after="0" w:line="240" w:lineRule="auto"/>
+        <w:rPr>
+          <w:rFonts w:ascii="Times New Roman" w:eastAsia="Times New Roman" w:hAnsi="Times New Roman" w:cs="Times New Roman"/>
+          <w:sz w:val="26"/>
+          <w:szCs w:val="26"/>
+          <w:lang w:eastAsia="pt-BR"/>
+        </w:rPr>
+      </w:pPr>
+      <w:r>
+        <w:rPr>
+          <w:rFonts w:ascii="Times New Roman" w:eastAsia="Times New Roman" w:hAnsi="Times New Roman" w:cs="Times New Roman"/>
+          <w:sz w:val="26"/>
+          <w:szCs w:val="26"/>
+          <w:lang w:eastAsia="pt-BR"/>
+        </w:rPr>
+        <w:t>│   └── app.js           &lt;-- (Módulo Específico / Regra do Evento)</w:t>
+      </w:r>
+    </w:p>
+    <w:p>
+      <w:pPr>
+        <w:tabs>
+          <w:tab w:val="left" w:pos="916"/>
+          <w:tab w:val="left" w:pos="1832"/>
+          <w:tab w:val="left" w:pos="2748"/>
+          <w:tab w:val="left" w:pos="3664"/>
+          <w:tab w:val="left" w:pos="4580"/>
+          <w:tab w:val="left" w:pos="5496"/>
+          <w:tab w:val="left" w:pos="6412"/>
+          <w:tab w:val="left" w:pos="7328"/>
+          <w:tab w:val="left" w:pos="8244"/>
+          <w:tab w:val="left" w:pos="9160"/>
+          <w:tab w:val="left" w:pos="10076"/>
+          <w:tab w:val="left" w:pos="10992"/>
+          <w:tab w:val="left" w:pos="11908"/>
+          <w:tab w:val="left" w:pos="12824"/>
+          <w:tab w:val="left" w:pos="13740"/>
+          <w:tab w:val="left" w:pos="14656"/>
+        </w:tabs>
+        <w:spacing w:after="0" w:line="240" w:lineRule="auto"/>
+        <w:rPr>
+          <w:rFonts w:ascii="Times New Roman" w:eastAsia="Times New Roman" w:hAnsi="Times New Roman" w:cs="Times New Roman"/>
+          <w:sz w:val="26"/>
+          <w:szCs w:val="26"/>
+          <w:lang w:eastAsia="pt-BR"/>
+        </w:rPr>
+      </w:pPr>
+      <w:r>
+        <w:rPr>
+          <w:rFonts w:ascii="Times New Roman" w:eastAsia="Times New Roman" w:hAnsi="Times New Roman" w:cs="Times New Roman"/>
+          <w:sz w:val="26"/>
+          <w:szCs w:val="26"/>
+          <w:lang w:eastAsia="pt-BR"/>
+        </w:rPr>
+        <w:t>└── index.html</w:t>
+      </w:r>
+    </w:p>
+    <w:p>
+      <w:pPr>
+        <w:tabs>
+          <w:tab w:val="left" w:pos="916"/>
+          <w:tab w:val="left" w:pos="1832"/>
+          <w:tab w:val="left" w:pos="2748"/>
+          <w:tab w:val="left" w:pos="3664"/>
+          <w:tab w:val="left" w:pos="4580"/>
+          <w:tab w:val="left" w:pos="5496"/>
+          <w:tab w:val="left" w:pos="6412"/>
+          <w:tab w:val="left" w:pos="7328"/>
+          <w:tab w:val="left" w:pos="8244"/>
+          <w:tab w:val="left" w:pos="9160"/>
+          <w:tab w:val="left" w:pos="10076"/>
+          <w:tab w:val="left" w:pos="10992"/>
+          <w:tab w:val="left" w:pos="11908"/>
+          <w:tab w:val="left" w:pos="12824"/>
+          <w:tab w:val="left" w:pos="13740"/>
+          <w:tab w:val="left" w:pos="14656"/>
+        </w:tabs>
+        <w:spacing w:after="0" w:line="240" w:lineRule="auto"/>
+        <w:rPr>
+          <w:rFonts w:ascii="Times New Roman" w:eastAsia="Times New Roman" w:hAnsi="Times New Roman" w:cs="Times New Roman"/>
+          <w:sz w:val="26"/>
+          <w:szCs w:val="26"/>
+          <w:lang w:eastAsia="pt-BR"/>
+        </w:rPr>
+      </w:pPr>
     </w:p>
     <w:tbl>
       <w:tblPr>
@@ -446,9 +859,9 @@
         <w:tblLook w:val="04A0" w:firstRow="1" w:lastRow="0" w:firstColumn="1" w:lastColumn="0" w:noHBand="0" w:noVBand="1"/>
       </w:tblPr>
       <w:tblGrid>
-        <w:gridCol w:w="1892"/>
-        <w:gridCol w:w="3322"/>
-        <w:gridCol w:w="3274"/>
+        <w:gridCol w:w="1932"/>
+        <w:gridCol w:w="3206"/>
+        <w:gridCol w:w="3350"/>
       </w:tblGrid>
       <w:tr>
         <w:trPr>
@@ -492,6 +905,7 @@
                 <w:szCs w:val="26"/>
                 <w:lang w:eastAsia="pt-BR"/>
               </w:rPr>
+              <w:lastRenderedPageBreak/>
               <w:t>Arquivo</w:t>
             </w:r>
           </w:p>
@@ -533,7 +947,7 @@
                 <w:szCs w:val="26"/>
                 <w:lang w:eastAsia="pt-BR"/>
               </w:rPr>
-              <w:t>Descrição da Responsabilidade</w:t>
+              <w:t>Responsabilidade</w:t>
             </w:r>
           </w:p>
         </w:tc>
@@ -611,6 +1025,7 @@
                 <w:lang w:eastAsia="pt-BR"/>
               </w:rPr>
             </w:pPr>
+            <w:proofErr w:type="spellStart"/>
             <w:r>
               <w:rPr>
                 <w:rFonts w:ascii="Times New Roman" w:eastAsia="Times New Roman" w:hAnsi="Times New Roman" w:cs="Times New Roman"/>
@@ -620,27 +1035,19 @@
                 <w:szCs w:val="26"/>
                 <w:lang w:eastAsia="pt-BR"/>
               </w:rPr>
-              <w:t>utils.js</w:t>
-            </w:r>
-            <w:r>
-              <w:rPr>
-                <w:rFonts w:ascii="Times New Roman" w:eastAsia="Times New Roman" w:hAnsi="Times New Roman" w:cs="Times New Roman"/>
-                <w:sz w:val="26"/>
-                <w:szCs w:val="26"/>
-                <w:lang w:eastAsia="pt-BR"/>
-              </w:rPr>
-              <w:t xml:space="preserve"> </w:t>
-            </w:r>
-            <w:r>
-              <w:rPr>
-                <w:rFonts w:ascii="Times New Roman" w:eastAsia="Times New Roman" w:hAnsi="Times New Roman" w:cs="Times New Roman"/>
-                <w:i/>
-                <w:iCs/>
-                <w:sz w:val="26"/>
-                <w:szCs w:val="26"/>
-                <w:lang w:eastAsia="pt-BR"/>
-              </w:rPr>
-              <w:t>(Reutilizável)</w:t>
+              <w:t>css</w:t>
+            </w:r>
+            <w:proofErr w:type="spellEnd"/>
+            <w:r>
+              <w:rPr>
+                <w:rFonts w:ascii="Times New Roman" w:eastAsia="Times New Roman" w:hAnsi="Times New Roman" w:cs="Times New Roman"/>
+                <w:b/>
+                <w:bCs/>
+                <w:sz w:val="26"/>
+                <w:szCs w:val="26"/>
+                <w:lang w:eastAsia="pt-BR"/>
+              </w:rPr>
+              <w:t>/style.css</w:t>
             </w:r>
           </w:p>
         </w:tc>
@@ -681,6 +1088,174 @@
                 <w:szCs w:val="26"/>
                 <w:lang w:eastAsia="pt-BR"/>
               </w:rPr>
+              <w:t>Estilização Visual:</w:t>
+            </w:r>
+            <w:r>
+              <w:rPr>
+                <w:rFonts w:ascii="Times New Roman" w:eastAsia="Times New Roman" w:hAnsi="Times New Roman" w:cs="Times New Roman"/>
+                <w:sz w:val="26"/>
+                <w:szCs w:val="26"/>
+                <w:lang w:eastAsia="pt-BR"/>
+              </w:rPr>
+              <w:t xml:space="preserve"> Centraliza a identidade do evento e estados de validação.</w:t>
+            </w:r>
+          </w:p>
+        </w:tc>
+        <w:tc>
+          <w:tcPr>
+            <w:tcW w:w="0" w:type="auto"/>
+            <w:tcBorders>
+              <w:top w:val="single" w:sz="6" w:space="0" w:color="C4C7C5"/>
+              <w:left w:val="single" w:sz="6" w:space="0" w:color="C4C7C5"/>
+              <w:bottom w:val="single" w:sz="6" w:space="0" w:color="C4C7C5"/>
+              <w:right w:val="single" w:sz="6" w:space="0" w:color="C4C7C5"/>
+            </w:tcBorders>
+            <w:tcMar>
+              <w:top w:w="120" w:type="dxa"/>
+              <w:left w:w="180" w:type="dxa"/>
+              <w:bottom w:w="120" w:type="dxa"/>
+              <w:right w:w="180" w:type="dxa"/>
+            </w:tcMar>
+            <w:vAlign w:val="center"/>
+            <w:hideMark/>
+          </w:tcPr>
+          <w:p>
+            <w:pPr>
+              <w:spacing w:after="480" w:line="240" w:lineRule="auto"/>
+              <w:rPr>
+                <w:rFonts w:ascii="Times New Roman" w:eastAsia="Times New Roman" w:hAnsi="Times New Roman" w:cs="Times New Roman"/>
+                <w:sz w:val="26"/>
+                <w:szCs w:val="26"/>
+                <w:lang w:eastAsia="pt-BR"/>
+              </w:rPr>
+            </w:pPr>
+            <w:r>
+              <w:rPr>
+                <w:rFonts w:ascii="Times New Roman" w:eastAsia="Times New Roman" w:hAnsi="Times New Roman" w:cs="Times New Roman"/>
+                <w:sz w:val="26"/>
+                <w:szCs w:val="26"/>
+                <w:lang w:eastAsia="pt-BR"/>
+              </w:rPr>
+              <w:t>Regras CSS do formulário, mensagens de erro/sucesso e destaques dos inputs.</w:t>
+            </w:r>
+          </w:p>
+        </w:tc>
+      </w:tr>
+      <w:tr>
+        <w:trPr>
+          <w:tblCellSpacing w:w="15" w:type="dxa"/>
+        </w:trPr>
+        <w:tc>
+          <w:tcPr>
+            <w:tcW w:w="0" w:type="auto"/>
+            <w:tcBorders>
+              <w:top w:val="single" w:sz="6" w:space="0" w:color="C4C7C5"/>
+              <w:left w:val="single" w:sz="6" w:space="0" w:color="C4C7C5"/>
+              <w:bottom w:val="single" w:sz="6" w:space="0" w:color="C4C7C5"/>
+              <w:right w:val="single" w:sz="6" w:space="0" w:color="C4C7C5"/>
+            </w:tcBorders>
+            <w:tcMar>
+              <w:top w:w="120" w:type="dxa"/>
+              <w:left w:w="180" w:type="dxa"/>
+              <w:bottom w:w="120" w:type="dxa"/>
+              <w:right w:w="180" w:type="dxa"/>
+            </w:tcMar>
+            <w:vAlign w:val="center"/>
+            <w:hideMark/>
+          </w:tcPr>
+          <w:p>
+            <w:pPr>
+              <w:spacing w:after="480" w:line="240" w:lineRule="auto"/>
+              <w:rPr>
+                <w:rFonts w:ascii="Times New Roman" w:eastAsia="Times New Roman" w:hAnsi="Times New Roman" w:cs="Times New Roman"/>
+                <w:sz w:val="26"/>
+                <w:szCs w:val="26"/>
+                <w:lang w:eastAsia="pt-BR"/>
+              </w:rPr>
+            </w:pPr>
+            <w:proofErr w:type="spellStart"/>
+            <w:r>
+              <w:rPr>
+                <w:rFonts w:ascii="Times New Roman" w:eastAsia="Times New Roman" w:hAnsi="Times New Roman" w:cs="Times New Roman"/>
+                <w:b/>
+                <w:bCs/>
+                <w:sz w:val="26"/>
+                <w:szCs w:val="26"/>
+                <w:lang w:eastAsia="pt-BR"/>
+              </w:rPr>
+              <w:t>js</w:t>
+            </w:r>
+            <w:proofErr w:type="spellEnd"/>
+            <w:r>
+              <w:rPr>
+                <w:rFonts w:ascii="Times New Roman" w:eastAsia="Times New Roman" w:hAnsi="Times New Roman" w:cs="Times New Roman"/>
+                <w:b/>
+                <w:bCs/>
+                <w:sz w:val="26"/>
+                <w:szCs w:val="26"/>
+                <w:lang w:eastAsia="pt-BR"/>
+              </w:rPr>
+              <w:t>/utils.js</w:t>
+            </w:r>
+            <w:r>
+              <w:rPr>
+                <w:rFonts w:ascii="Times New Roman" w:eastAsia="Times New Roman" w:hAnsi="Times New Roman" w:cs="Times New Roman"/>
+                <w:sz w:val="26"/>
+                <w:szCs w:val="26"/>
+                <w:lang w:eastAsia="pt-BR"/>
+              </w:rPr>
+              <w:t xml:space="preserve"> </w:t>
+            </w:r>
+            <w:r>
+              <w:rPr>
+                <w:rFonts w:ascii="Times New Roman" w:eastAsia="Times New Roman" w:hAnsi="Times New Roman" w:cs="Times New Roman"/>
+                <w:i/>
+                <w:iCs/>
+                <w:sz w:val="26"/>
+                <w:szCs w:val="26"/>
+                <w:lang w:eastAsia="pt-BR"/>
+              </w:rPr>
+              <w:t>(Reutilizável)</w:t>
+            </w:r>
+          </w:p>
+        </w:tc>
+        <w:tc>
+          <w:tcPr>
+            <w:tcW w:w="0" w:type="auto"/>
+            <w:tcBorders>
+              <w:top w:val="single" w:sz="6" w:space="0" w:color="C4C7C5"/>
+              <w:left w:val="single" w:sz="6" w:space="0" w:color="C4C7C5"/>
+              <w:bottom w:val="single" w:sz="6" w:space="0" w:color="C4C7C5"/>
+              <w:right w:val="single" w:sz="6" w:space="0" w:color="C4C7C5"/>
+            </w:tcBorders>
+            <w:tcMar>
+              <w:top w:w="120" w:type="dxa"/>
+              <w:left w:w="180" w:type="dxa"/>
+              <w:bottom w:w="120" w:type="dxa"/>
+              <w:right w:w="180" w:type="dxa"/>
+            </w:tcMar>
+            <w:vAlign w:val="center"/>
+            <w:hideMark/>
+          </w:tcPr>
+          <w:p>
+            <w:pPr>
+              <w:spacing w:after="480" w:line="240" w:lineRule="auto"/>
+              <w:rPr>
+                <w:rFonts w:ascii="Times New Roman" w:eastAsia="Times New Roman" w:hAnsi="Times New Roman" w:cs="Times New Roman"/>
+                <w:sz w:val="26"/>
+                <w:szCs w:val="26"/>
+                <w:lang w:eastAsia="pt-BR"/>
+              </w:rPr>
+            </w:pPr>
+            <w:r>
+              <w:rPr>
+                <w:rFonts w:ascii="Times New Roman" w:eastAsia="Times New Roman" w:hAnsi="Times New Roman" w:cs="Times New Roman"/>
+                <w:b/>
+                <w:bCs/>
+                <w:sz w:val="26"/>
+                <w:szCs w:val="26"/>
+                <w:lang w:eastAsia="pt-BR"/>
+              </w:rPr>
               <w:t>Funções Genéricas de Infraestrutura:</w:t>
             </w:r>
             <w:r>
@@ -690,7 +1265,7 @@
                 <w:szCs w:val="26"/>
                 <w:lang w:eastAsia="pt-BR"/>
               </w:rPr>
-              <w:t xml:space="preserve"> Podem ser copiadas e usadas em qualquer outro projeto ou formulário da empresa sem nenhuma alteração.</w:t>
+              <w:t xml:space="preserve"> Utilitários reutilizáveis em qualquer outro formulário da empresa.</w:t>
             </w:r>
           </w:p>
         </w:tc>
@@ -729,7 +1304,27 @@
                 <w:szCs w:val="26"/>
                 <w:lang w:eastAsia="pt-BR"/>
               </w:rPr>
-              <w:t>1. Algoritmo de Validação do CPF (validarCPF).</w:t>
+              <w:t>1. Algoritmo de Validação do CPF (</w:t>
+            </w:r>
+            <w:proofErr w:type="spellStart"/>
+            <w:r>
+              <w:rPr>
+                <w:rFonts w:ascii="Times New Roman" w:eastAsia="Times New Roman" w:hAnsi="Times New Roman" w:cs="Times New Roman"/>
+                <w:sz w:val="26"/>
+                <w:szCs w:val="26"/>
+                <w:lang w:eastAsia="pt-BR"/>
+              </w:rPr>
+              <w:t>validarCPF</w:t>
+            </w:r>
+            <w:proofErr w:type="spellEnd"/>
+            <w:r>
+              <w:rPr>
+                <w:rFonts w:ascii="Times New Roman" w:eastAsia="Times New Roman" w:hAnsi="Times New Roman" w:cs="Times New Roman"/>
+                <w:sz w:val="26"/>
+                <w:szCs w:val="26"/>
+                <w:lang w:eastAsia="pt-BR"/>
+              </w:rPr>
+              <w:t>).</w:t>
             </w:r>
           </w:p>
           <w:p>
@@ -769,7 +1364,47 @@
                 <w:szCs w:val="26"/>
                 <w:lang w:eastAsia="pt-BR"/>
               </w:rPr>
-              <w:t>2. Função Genérica de Download de Arquivo TXT via Blob (salvarDadosEmTXT).</w:t>
+              <w:t xml:space="preserve">2. Função Genérica de Download via </w:t>
+            </w:r>
+            <w:proofErr w:type="spellStart"/>
+            <w:r>
+              <w:rPr>
+                <w:rFonts w:ascii="Times New Roman" w:eastAsia="Times New Roman" w:hAnsi="Times New Roman" w:cs="Times New Roman"/>
+                <w:sz w:val="26"/>
+                <w:szCs w:val="26"/>
+                <w:lang w:eastAsia="pt-BR"/>
+              </w:rPr>
+              <w:t>Blob</w:t>
+            </w:r>
+            <w:proofErr w:type="spellEnd"/>
+            <w:r>
+              <w:rPr>
+                <w:rFonts w:ascii="Times New Roman" w:eastAsia="Times New Roman" w:hAnsi="Times New Roman" w:cs="Times New Roman"/>
+                <w:sz w:val="26"/>
+                <w:szCs w:val="26"/>
+                <w:lang w:eastAsia="pt-BR"/>
+              </w:rPr>
+              <w:t xml:space="preserve"> (</w:t>
+            </w:r>
+            <w:proofErr w:type="spellStart"/>
+            <w:r>
+              <w:rPr>
+                <w:rFonts w:ascii="Times New Roman" w:eastAsia="Times New Roman" w:hAnsi="Times New Roman" w:cs="Times New Roman"/>
+                <w:sz w:val="26"/>
+                <w:szCs w:val="26"/>
+                <w:lang w:eastAsia="pt-BR"/>
+              </w:rPr>
+              <w:t>salvarDadosEmTXT</w:t>
+            </w:r>
+            <w:proofErr w:type="spellEnd"/>
+            <w:r>
+              <w:rPr>
+                <w:rFonts w:ascii="Times New Roman" w:eastAsia="Times New Roman" w:hAnsi="Times New Roman" w:cs="Times New Roman"/>
+                <w:sz w:val="26"/>
+                <w:szCs w:val="26"/>
+                <w:lang w:eastAsia="pt-BR"/>
+              </w:rPr>
+              <w:t>).</w:t>
             </w:r>
           </w:p>
         </w:tc>
@@ -806,6 +1441,7 @@
                 <w:lang w:eastAsia="pt-BR"/>
               </w:rPr>
             </w:pPr>
+            <w:proofErr w:type="spellStart"/>
             <w:r>
               <w:rPr>
                 <w:rFonts w:ascii="Times New Roman" w:eastAsia="Times New Roman" w:hAnsi="Times New Roman" w:cs="Times New Roman"/>
@@ -815,8 +1451,19 @@
                 <w:szCs w:val="26"/>
                 <w:lang w:eastAsia="pt-BR"/>
               </w:rPr>
-              <w:lastRenderedPageBreak/>
-              <w:t>app.js</w:t>
+              <w:t>js</w:t>
+            </w:r>
+            <w:proofErr w:type="spellEnd"/>
+            <w:r>
+              <w:rPr>
+                <w:rFonts w:ascii="Times New Roman" w:eastAsia="Times New Roman" w:hAnsi="Times New Roman" w:cs="Times New Roman"/>
+                <w:b/>
+                <w:bCs/>
+                <w:sz w:val="26"/>
+                <w:szCs w:val="26"/>
+                <w:lang w:eastAsia="pt-BR"/>
+              </w:rPr>
+              <w:t>/app.js</w:t>
             </w:r>
             <w:r>
               <w:rPr>
@@ -886,7 +1533,7 @@
                 <w:szCs w:val="26"/>
                 <w:lang w:eastAsia="pt-BR"/>
               </w:rPr>
-              <w:t xml:space="preserve"> Contém os elementos de interface e eventos exclusivos deste formulário.</w:t>
+              <w:t xml:space="preserve"> Manipulação do DOM e eventos exclusivos deste formulário.</w:t>
             </w:r>
           </w:p>
         </w:tc>
@@ -925,7 +1572,27 @@
                 <w:szCs w:val="26"/>
                 <w:lang w:eastAsia="pt-BR"/>
               </w:rPr>
-              <w:t>1. Mapeamento do DOM (getElementById).</w:t>
+              <w:t>1. Mapeamento do DOM (</w:t>
+            </w:r>
+            <w:proofErr w:type="spellStart"/>
+            <w:r>
+              <w:rPr>
+                <w:rFonts w:ascii="Times New Roman" w:eastAsia="Times New Roman" w:hAnsi="Times New Roman" w:cs="Times New Roman"/>
+                <w:sz w:val="26"/>
+                <w:szCs w:val="26"/>
+                <w:lang w:eastAsia="pt-BR"/>
+              </w:rPr>
+              <w:t>getElementById</w:t>
+            </w:r>
+            <w:proofErr w:type="spellEnd"/>
+            <w:r>
+              <w:rPr>
+                <w:rFonts w:ascii="Times New Roman" w:eastAsia="Times New Roman" w:hAnsi="Times New Roman" w:cs="Times New Roman"/>
+                <w:sz w:val="26"/>
+                <w:szCs w:val="26"/>
+                <w:lang w:eastAsia="pt-BR"/>
+              </w:rPr>
+              <w:t>).</w:t>
             </w:r>
           </w:p>
           <w:p>
@@ -965,7 +1632,47 @@
                 <w:szCs w:val="26"/>
                 <w:lang w:eastAsia="pt-BR"/>
               </w:rPr>
-              <w:t>2. Função de popular o Datalist com artistasData.</w:t>
+              <w:t xml:space="preserve">2. Função para popular o </w:t>
+            </w:r>
+            <w:proofErr w:type="spellStart"/>
+            <w:r>
+              <w:rPr>
+                <w:rFonts w:ascii="Times New Roman" w:eastAsia="Times New Roman" w:hAnsi="Times New Roman" w:cs="Times New Roman"/>
+                <w:sz w:val="26"/>
+                <w:szCs w:val="26"/>
+                <w:lang w:eastAsia="pt-BR"/>
+              </w:rPr>
+              <w:t>Datalist</w:t>
+            </w:r>
+            <w:proofErr w:type="spellEnd"/>
+            <w:r>
+              <w:rPr>
+                <w:rFonts w:ascii="Times New Roman" w:eastAsia="Times New Roman" w:hAnsi="Times New Roman" w:cs="Times New Roman"/>
+                <w:sz w:val="26"/>
+                <w:szCs w:val="26"/>
+                <w:lang w:eastAsia="pt-BR"/>
+              </w:rPr>
+              <w:t xml:space="preserve"> com </w:t>
+            </w:r>
+            <w:proofErr w:type="spellStart"/>
+            <w:r>
+              <w:rPr>
+                <w:rFonts w:ascii="Times New Roman" w:eastAsia="Times New Roman" w:hAnsi="Times New Roman" w:cs="Times New Roman"/>
+                <w:sz w:val="26"/>
+                <w:szCs w:val="26"/>
+                <w:lang w:eastAsia="pt-BR"/>
+              </w:rPr>
+              <w:t>artistasData</w:t>
+            </w:r>
+            <w:proofErr w:type="spellEnd"/>
+            <w:r>
+              <w:rPr>
+                <w:rFonts w:ascii="Times New Roman" w:eastAsia="Times New Roman" w:hAnsi="Times New Roman" w:cs="Times New Roman"/>
+                <w:sz w:val="26"/>
+                <w:szCs w:val="26"/>
+                <w:lang w:eastAsia="pt-BR"/>
+              </w:rPr>
+              <w:t>.</w:t>
             </w:r>
           </w:p>
           <w:p>
@@ -1005,7 +1712,7 @@
                 <w:szCs w:val="26"/>
                 <w:lang w:eastAsia="pt-BR"/>
               </w:rPr>
-              <w:t>3. Evento do botão Cadastrar (click).</w:t>
+              <w:t>3. Evento click do botão Cadastrar.</w:t>
             </w:r>
           </w:p>
           <w:p>
@@ -1045,7 +1752,7 @@
                 <w:szCs w:val="26"/>
                 <w:lang w:eastAsia="pt-BR"/>
               </w:rPr>
-              <w:t>4. Leitura dos campos específicos do festival.</w:t>
+              <w:t>4. Leitura e validação dos campos da interface.</w:t>
             </w:r>
           </w:p>
         </w:tc>
@@ -1054,7 +1761,6 @@
     <w:p>
       <w:pPr>
         <w:spacing w:before="100" w:beforeAutospacing="1" w:after="100" w:afterAutospacing="1" w:line="240" w:lineRule="auto"/>
-        <w:outlineLvl w:val="3"/>
         <w:rPr>
           <w:rFonts w:ascii="Times New Roman" w:eastAsia="Times New Roman" w:hAnsi="Times New Roman" w:cs="Times New Roman"/>
           <w:b/>
@@ -1064,7 +1770,10 @@
           <w:lang w:eastAsia="pt-BR"/>
         </w:rPr>
       </w:pPr>
-      <w:r>
+    </w:p>
+    <w:p>
+      <w:pPr>
+        <w:spacing w:before="100" w:beforeAutospacing="1" w:after="100" w:afterAutospacing="1" w:line="240" w:lineRule="auto"/>
         <w:rPr>
           <w:rFonts w:ascii="Times New Roman" w:eastAsia="Times New Roman" w:hAnsi="Times New Roman" w:cs="Times New Roman"/>
           <w:b/>
@@ -1073,8 +1782,7 @@
           <w:szCs w:val="26"/>
           <w:lang w:eastAsia="pt-BR"/>
         </w:rPr>
-        <w:t>3. Instrução de Importação no HTML</w:t>
-      </w:r>
+      </w:pPr>
     </w:p>
     <w:p>
       <w:pPr>
@@ -1086,15 +1794,6 @@
           <w:lang w:eastAsia="pt-BR"/>
         </w:rPr>
       </w:pPr>
-      <w:r>
-        <w:rPr>
-          <w:rFonts w:ascii="Times New Roman" w:eastAsia="Times New Roman" w:hAnsi="Times New Roman" w:cs="Times New Roman"/>
-          <w:sz w:val="26"/>
-          <w:szCs w:val="26"/>
-          <w:lang w:eastAsia="pt-BR"/>
-        </w:rPr>
-        <w:t xml:space="preserve">Oriente os alunos a ajustarem as tags &lt;script&gt; no final do index.html. A ordem de importação é </w:t>
-      </w:r>
       <w:r>
         <w:rPr>
           <w:rFonts w:ascii="Times New Roman" w:eastAsia="Times New Roman" w:hAnsi="Times New Roman" w:cs="Times New Roman"/>
@@ -1104,34 +1803,68 @@
           <w:szCs w:val="26"/>
           <w:lang w:eastAsia="pt-BR"/>
         </w:rPr>
-        <w:t>crucial</w:t>
-      </w:r>
-      <w:r>
-        <w:rPr>
-          <w:rFonts w:ascii="Times New Roman" w:eastAsia="Times New Roman" w:hAnsi="Times New Roman" w:cs="Times New Roman"/>
-          <w:sz w:val="26"/>
-          <w:szCs w:val="26"/>
-          <w:lang w:eastAsia="pt-BR"/>
-        </w:rPr>
-        <w:t xml:space="preserve"> para que o app.js consiga enxergar as funções criadas nos outros arquivos</w:t>
-      </w:r>
-      <w:r>
-        <w:rPr>
-          <w:rFonts w:ascii="Times New Roman" w:eastAsia="Times New Roman" w:hAnsi="Times New Roman" w:cs="Times New Roman"/>
-          <w:sz w:val="26"/>
-          <w:szCs w:val="26"/>
-          <w:lang w:eastAsia="pt-BR"/>
-        </w:rPr>
-        <w:t xml:space="preserve"> e em ordem de atuação</w:t>
-      </w:r>
-      <w:r>
-        <w:rPr>
-          <w:rFonts w:ascii="Times New Roman" w:eastAsia="Times New Roman" w:hAnsi="Times New Roman" w:cs="Times New Roman"/>
-          <w:sz w:val="26"/>
-          <w:szCs w:val="26"/>
-          <w:lang w:eastAsia="pt-BR"/>
-        </w:rPr>
-        <w:t>:</w:t>
+        <w:lastRenderedPageBreak/>
+        <w:t>3. Instrução de Importação no index.html</w:t>
+      </w:r>
+    </w:p>
+    <w:p>
+      <w:pPr>
+        <w:spacing w:before="100" w:beforeAutospacing="1" w:after="100" w:afterAutospacing="1" w:line="240" w:lineRule="auto"/>
+        <w:rPr>
+          <w:rFonts w:ascii="Times New Roman" w:eastAsia="Times New Roman" w:hAnsi="Times New Roman" w:cs="Times New Roman"/>
+          <w:sz w:val="26"/>
+          <w:szCs w:val="26"/>
+          <w:lang w:eastAsia="pt-BR"/>
+        </w:rPr>
+      </w:pPr>
+      <w:r>
+        <w:rPr>
+          <w:rFonts w:ascii="Times New Roman" w:eastAsia="Times New Roman" w:hAnsi="Times New Roman" w:cs="Times New Roman"/>
+          <w:sz w:val="26"/>
+          <w:szCs w:val="26"/>
+          <w:lang w:eastAsia="pt-BR"/>
+        </w:rPr>
+        <w:t xml:space="preserve">As chamadas no index.html devem ser ajustadas para apontar para as pastas </w:t>
+      </w:r>
+      <w:proofErr w:type="spellStart"/>
+      <w:r>
+        <w:rPr>
+          <w:rFonts w:ascii="Times New Roman" w:eastAsia="Times New Roman" w:hAnsi="Times New Roman" w:cs="Times New Roman"/>
+          <w:sz w:val="26"/>
+          <w:szCs w:val="26"/>
+          <w:lang w:eastAsia="pt-BR"/>
+        </w:rPr>
+        <w:t>css</w:t>
+      </w:r>
+      <w:proofErr w:type="spellEnd"/>
+      <w:r>
+        <w:rPr>
+          <w:rFonts w:ascii="Times New Roman" w:eastAsia="Times New Roman" w:hAnsi="Times New Roman" w:cs="Times New Roman"/>
+          <w:sz w:val="26"/>
+          <w:szCs w:val="26"/>
+          <w:lang w:eastAsia="pt-BR"/>
+        </w:rPr>
+        <w:t xml:space="preserve">/ e </w:t>
+      </w:r>
+      <w:proofErr w:type="spellStart"/>
+      <w:r>
+        <w:rPr>
+          <w:rFonts w:ascii="Times New Roman" w:eastAsia="Times New Roman" w:hAnsi="Times New Roman" w:cs="Times New Roman"/>
+          <w:sz w:val="26"/>
+          <w:szCs w:val="26"/>
+          <w:lang w:eastAsia="pt-BR"/>
+        </w:rPr>
+        <w:t>js</w:t>
+      </w:r>
+      <w:proofErr w:type="spellEnd"/>
+      <w:r>
+        <w:rPr>
+          <w:rFonts w:ascii="Times New Roman" w:eastAsia="Times New Roman" w:hAnsi="Times New Roman" w:cs="Times New Roman"/>
+          <w:sz w:val="26"/>
+          <w:szCs w:val="26"/>
+          <w:lang w:eastAsia="pt-BR"/>
+        </w:rPr>
+        <w:t>/. A ordem dos scripts no final do &lt;body&gt; deve respeitar a hierarquia de dependências:</w:t>
       </w:r>
     </w:p>
     <w:p>
@@ -1141,15 +1874,15 @@
           <w:rFonts w:ascii="Times New Roman" w:eastAsia="Times New Roman" w:hAnsi="Times New Roman" w:cs="Times New Roman"/>
           <w:sz w:val="26"/>
           <w:szCs w:val="26"/>
-          <w:lang w:eastAsia="pt-BR"/>
-        </w:rPr>
-      </w:pPr>
-      <w:r>
-        <w:rPr>
-          <w:rFonts w:ascii="Times New Roman" w:eastAsia="Times New Roman" w:hAnsi="Times New Roman" w:cs="Times New Roman"/>
-          <w:sz w:val="26"/>
-          <w:szCs w:val="26"/>
-          <w:lang w:eastAsia="pt-BR"/>
+          <w:lang w:val="en-US" w:eastAsia="pt-BR"/>
+        </w:rPr>
+      </w:pPr>
+      <w:r>
+        <w:rPr>
+          <w:rFonts w:ascii="Times New Roman" w:eastAsia="Times New Roman" w:hAnsi="Times New Roman" w:cs="Times New Roman"/>
+          <w:sz w:val="26"/>
+          <w:szCs w:val="26"/>
+          <w:lang w:val="en-US" w:eastAsia="pt-BR"/>
         </w:rPr>
         <w:t>HTML</w:t>
       </w:r>
@@ -1187,9 +1920,29 @@
           <w:rFonts w:ascii="Times New Roman" w:eastAsia="Times New Roman" w:hAnsi="Times New Roman" w:cs="Times New Roman"/>
           <w:sz w:val="26"/>
           <w:szCs w:val="26"/>
-          <w:lang w:eastAsia="pt-BR"/>
-        </w:rPr>
-        <w:t xml:space="preserve">    &lt;!-- 1. Massa de Dados do Festival --&gt;</w:t>
+          <w:lang w:val="en-US" w:eastAsia="pt-BR"/>
+        </w:rPr>
+        <w:t xml:space="preserve">    </w:t>
+      </w:r>
+      <w:proofErr w:type="gramStart"/>
+      <w:r>
+        <w:rPr>
+          <w:rFonts w:ascii="Times New Roman" w:eastAsia="Times New Roman" w:hAnsi="Times New Roman" w:cs="Times New Roman"/>
+          <w:sz w:val="26"/>
+          <w:szCs w:val="26"/>
+          <w:lang w:eastAsia="pt-BR"/>
+        </w:rPr>
+        <w:t>&lt;!--</w:t>
+      </w:r>
+      <w:proofErr w:type="gramEnd"/>
+      <w:r>
+        <w:rPr>
+          <w:rFonts w:ascii="Times New Roman" w:eastAsia="Times New Roman" w:hAnsi="Times New Roman" w:cs="Times New Roman"/>
+          <w:sz w:val="26"/>
+          <w:szCs w:val="26"/>
+          <w:lang w:eastAsia="pt-BR"/>
+        </w:rPr>
+        <w:t xml:space="preserve"> 1. Estilos da Aplicação --&gt;</w:t>
       </w:r>
     </w:p>
     <w:p>
@@ -1217,26 +1970,97 @@
           <w:rFonts w:ascii="Times New Roman" w:eastAsia="Times New Roman" w:hAnsi="Times New Roman" w:cs="Times New Roman"/>
           <w:sz w:val="26"/>
           <w:szCs w:val="26"/>
-          <w:lang w:val="en-US" w:eastAsia="pt-BR"/>
-        </w:rPr>
-      </w:pPr>
-      <w:r>
-        <w:rPr>
-          <w:rFonts w:ascii="Times New Roman" w:eastAsia="Times New Roman" w:hAnsi="Times New Roman" w:cs="Times New Roman"/>
-          <w:sz w:val="26"/>
-          <w:szCs w:val="26"/>
-          <w:lang w:eastAsia="pt-BR"/>
-        </w:rPr>
-        <w:t xml:space="preserve">    </w:t>
-      </w:r>
-      <w:r>
-        <w:rPr>
-          <w:rFonts w:ascii="Times New Roman" w:eastAsia="Times New Roman" w:hAnsi="Times New Roman" w:cs="Times New Roman"/>
-          <w:sz w:val="26"/>
-          <w:szCs w:val="26"/>
-          <w:lang w:val="en-US" w:eastAsia="pt-BR"/>
-        </w:rPr>
-        <w:t>&lt;script src="artistasData.js"&gt;&lt;/script&gt;</w:t>
+          <w:lang w:eastAsia="pt-BR"/>
+        </w:rPr>
+      </w:pPr>
+      <w:r>
+        <w:rPr>
+          <w:rFonts w:ascii="Times New Roman" w:eastAsia="Times New Roman" w:hAnsi="Times New Roman" w:cs="Times New Roman"/>
+          <w:sz w:val="26"/>
+          <w:szCs w:val="26"/>
+          <w:lang w:eastAsia="pt-BR"/>
+        </w:rPr>
+        <w:t xml:space="preserve">    &lt;link </w:t>
+      </w:r>
+      <w:proofErr w:type="spellStart"/>
+      <w:r>
+        <w:rPr>
+          <w:rFonts w:ascii="Times New Roman" w:eastAsia="Times New Roman" w:hAnsi="Times New Roman" w:cs="Times New Roman"/>
+          <w:sz w:val="26"/>
+          <w:szCs w:val="26"/>
+          <w:lang w:eastAsia="pt-BR"/>
+        </w:rPr>
+        <w:t>rel</w:t>
+      </w:r>
+      <w:proofErr w:type="spellEnd"/>
+      <w:r>
+        <w:rPr>
+          <w:rFonts w:ascii="Times New Roman" w:eastAsia="Times New Roman" w:hAnsi="Times New Roman" w:cs="Times New Roman"/>
+          <w:sz w:val="26"/>
+          <w:szCs w:val="26"/>
+          <w:lang w:eastAsia="pt-BR"/>
+        </w:rPr>
+        <w:t>="</w:t>
+      </w:r>
+      <w:proofErr w:type="spellStart"/>
+      <w:r>
+        <w:rPr>
+          <w:rFonts w:ascii="Times New Roman" w:eastAsia="Times New Roman" w:hAnsi="Times New Roman" w:cs="Times New Roman"/>
+          <w:sz w:val="26"/>
+          <w:szCs w:val="26"/>
+          <w:lang w:eastAsia="pt-BR"/>
+        </w:rPr>
+        <w:t>stylesheet</w:t>
+      </w:r>
+      <w:proofErr w:type="spellEnd"/>
+      <w:r>
+        <w:rPr>
+          <w:rFonts w:ascii="Times New Roman" w:eastAsia="Times New Roman" w:hAnsi="Times New Roman" w:cs="Times New Roman"/>
+          <w:sz w:val="26"/>
+          <w:szCs w:val="26"/>
+          <w:lang w:eastAsia="pt-BR"/>
+        </w:rPr>
+        <w:t xml:space="preserve">" </w:t>
+      </w:r>
+      <w:proofErr w:type="spellStart"/>
+      <w:r>
+        <w:rPr>
+          <w:rFonts w:ascii="Times New Roman" w:eastAsia="Times New Roman" w:hAnsi="Times New Roman" w:cs="Times New Roman"/>
+          <w:sz w:val="26"/>
+          <w:szCs w:val="26"/>
+          <w:lang w:eastAsia="pt-BR"/>
+        </w:rPr>
+        <w:t>href</w:t>
+      </w:r>
+      <w:proofErr w:type="spellEnd"/>
+      <w:r>
+        <w:rPr>
+          <w:rFonts w:ascii="Times New Roman" w:eastAsia="Times New Roman" w:hAnsi="Times New Roman" w:cs="Times New Roman"/>
+          <w:sz w:val="26"/>
+          <w:szCs w:val="26"/>
+          <w:lang w:eastAsia="pt-BR"/>
+        </w:rPr>
+        <w:t>="</w:t>
+      </w:r>
+      <w:proofErr w:type="spellStart"/>
+      <w:r>
+        <w:rPr>
+          <w:rFonts w:ascii="Times New Roman" w:eastAsia="Times New Roman" w:hAnsi="Times New Roman" w:cs="Times New Roman"/>
+          <w:sz w:val="26"/>
+          <w:szCs w:val="26"/>
+          <w:lang w:eastAsia="pt-BR"/>
+        </w:rPr>
+        <w:t>css</w:t>
+      </w:r>
+      <w:proofErr w:type="spellEnd"/>
+      <w:r>
+        <w:rPr>
+          <w:rFonts w:ascii="Times New Roman" w:eastAsia="Times New Roman" w:hAnsi="Times New Roman" w:cs="Times New Roman"/>
+          <w:sz w:val="26"/>
+          <w:szCs w:val="26"/>
+          <w:lang w:eastAsia="pt-BR"/>
+        </w:rPr>
+        <w:t>/style.css"&gt;</w:t>
       </w:r>
     </w:p>
     <w:p>
@@ -1264,15 +2088,15 @@
           <w:rFonts w:ascii="Times New Roman" w:eastAsia="Times New Roman" w:hAnsi="Times New Roman" w:cs="Times New Roman"/>
           <w:sz w:val="26"/>
           <w:szCs w:val="26"/>
-          <w:lang w:val="en-US" w:eastAsia="pt-BR"/>
-        </w:rPr>
-      </w:pPr>
-      <w:r>
-        <w:rPr>
-          <w:rFonts w:ascii="Times New Roman" w:eastAsia="Times New Roman" w:hAnsi="Times New Roman" w:cs="Times New Roman"/>
-          <w:sz w:val="26"/>
-          <w:szCs w:val="26"/>
-          <w:lang w:val="en-US" w:eastAsia="pt-BR"/>
+          <w:lang w:eastAsia="pt-BR"/>
+        </w:rPr>
+      </w:pPr>
+      <w:r>
+        <w:rPr>
+          <w:rFonts w:ascii="Times New Roman" w:eastAsia="Times New Roman" w:hAnsi="Times New Roman" w:cs="Times New Roman"/>
+          <w:sz w:val="26"/>
+          <w:szCs w:val="26"/>
+          <w:lang w:eastAsia="pt-BR"/>
         </w:rPr>
         <w:t xml:space="preserve">    </w:t>
       </w:r>
@@ -1310,18 +2134,29 @@
           <w:rFonts w:ascii="Times New Roman" w:eastAsia="Times New Roman" w:hAnsi="Times New Roman" w:cs="Times New Roman"/>
           <w:sz w:val="26"/>
           <w:szCs w:val="26"/>
-          <w:lang w:val="en-US" w:eastAsia="pt-BR"/>
+          <w:lang w:eastAsia="pt-BR"/>
         </w:rPr>
         <w:t xml:space="preserve">    </w:t>
       </w:r>
-      <w:r>
-        <w:rPr>
-          <w:rFonts w:ascii="Times New Roman" w:eastAsia="Times New Roman" w:hAnsi="Times New Roman" w:cs="Times New Roman"/>
-          <w:sz w:val="26"/>
-          <w:szCs w:val="26"/>
-          <w:lang w:eastAsia="pt-BR"/>
-        </w:rPr>
-        <w:t>&lt;!-- 2. Utilitários Reutilizáveis (Deve vir ANTES do app.js) --&gt;</w:t>
+      <w:proofErr w:type="gramStart"/>
+      <w:r>
+        <w:rPr>
+          <w:rFonts w:ascii="Times New Roman" w:eastAsia="Times New Roman" w:hAnsi="Times New Roman" w:cs="Times New Roman"/>
+          <w:sz w:val="26"/>
+          <w:szCs w:val="26"/>
+          <w:lang w:eastAsia="pt-BR"/>
+        </w:rPr>
+        <w:t>&lt;!--</w:t>
+      </w:r>
+      <w:proofErr w:type="gramEnd"/>
+      <w:r>
+        <w:rPr>
+          <w:rFonts w:ascii="Times New Roman" w:eastAsia="Times New Roman" w:hAnsi="Times New Roman" w:cs="Times New Roman"/>
+          <w:sz w:val="26"/>
+          <w:szCs w:val="26"/>
+          <w:lang w:eastAsia="pt-BR"/>
+        </w:rPr>
+        <w:t xml:space="preserve"> 1. Massa de Dados (Base de dados do festival) --&gt;</w:t>
       </w:r>
     </w:p>
     <w:p>
@@ -1368,7 +2203,47 @@
           <w:szCs w:val="26"/>
           <w:lang w:val="en-US" w:eastAsia="pt-BR"/>
         </w:rPr>
-        <w:t>&lt;script src="utils.js"&gt;&lt;/script&gt;</w:t>
+        <w:t xml:space="preserve">&lt;script </w:t>
+      </w:r>
+      <w:proofErr w:type="spellStart"/>
+      <w:r>
+        <w:rPr>
+          <w:rFonts w:ascii="Times New Roman" w:eastAsia="Times New Roman" w:hAnsi="Times New Roman" w:cs="Times New Roman"/>
+          <w:sz w:val="26"/>
+          <w:szCs w:val="26"/>
+          <w:lang w:val="en-US" w:eastAsia="pt-BR"/>
+        </w:rPr>
+        <w:t>src</w:t>
+      </w:r>
+      <w:proofErr w:type="spellEnd"/>
+      <w:r>
+        <w:rPr>
+          <w:rFonts w:ascii="Times New Roman" w:eastAsia="Times New Roman" w:hAnsi="Times New Roman" w:cs="Times New Roman"/>
+          <w:sz w:val="26"/>
+          <w:szCs w:val="26"/>
+          <w:lang w:val="en-US" w:eastAsia="pt-BR"/>
+        </w:rPr>
+        <w:t>="</w:t>
+      </w:r>
+      <w:proofErr w:type="spellStart"/>
+      <w:r>
+        <w:rPr>
+          <w:rFonts w:ascii="Times New Roman" w:eastAsia="Times New Roman" w:hAnsi="Times New Roman" w:cs="Times New Roman"/>
+          <w:sz w:val="26"/>
+          <w:szCs w:val="26"/>
+          <w:lang w:val="en-US" w:eastAsia="pt-BR"/>
+        </w:rPr>
+        <w:t>js</w:t>
+      </w:r>
+      <w:proofErr w:type="spellEnd"/>
+      <w:r>
+        <w:rPr>
+          <w:rFonts w:ascii="Times New Roman" w:eastAsia="Times New Roman" w:hAnsi="Times New Roman" w:cs="Times New Roman"/>
+          <w:sz w:val="26"/>
+          <w:szCs w:val="26"/>
+          <w:lang w:val="en-US" w:eastAsia="pt-BR"/>
+        </w:rPr>
+        <w:t>/artistasData.js"&gt;&lt;/script&gt;</w:t>
       </w:r>
     </w:p>
     <w:p>
@@ -1446,14 +2321,65 @@
         </w:rPr>
         <w:t xml:space="preserve">    </w:t>
       </w:r>
-      <w:r>
-        <w:rPr>
-          <w:rFonts w:ascii="Times New Roman" w:eastAsia="Times New Roman" w:hAnsi="Times New Roman" w:cs="Times New Roman"/>
-          <w:sz w:val="26"/>
-          <w:szCs w:val="26"/>
-          <w:lang w:eastAsia="pt-BR"/>
-        </w:rPr>
-        <w:t>&lt;!-- 3. Lógica Específica da Aplicação --&gt;</w:t>
+      <w:proofErr w:type="gramStart"/>
+      <w:r>
+        <w:rPr>
+          <w:rFonts w:ascii="Times New Roman" w:eastAsia="Times New Roman" w:hAnsi="Times New Roman" w:cs="Times New Roman"/>
+          <w:sz w:val="26"/>
+          <w:szCs w:val="26"/>
+          <w:lang w:eastAsia="pt-BR"/>
+        </w:rPr>
+        <w:t>&lt;!--</w:t>
+      </w:r>
+      <w:proofErr w:type="gramEnd"/>
+      <w:r>
+        <w:rPr>
+          <w:rFonts w:ascii="Times New Roman" w:eastAsia="Times New Roman" w:hAnsi="Times New Roman" w:cs="Times New Roman"/>
+          <w:sz w:val="26"/>
+          <w:szCs w:val="26"/>
+          <w:lang w:eastAsia="pt-BR"/>
+        </w:rPr>
+        <w:t xml:space="preserve"> 2. Utilitários Reutilizáveis (Provedor das funções </w:t>
+      </w:r>
+      <w:proofErr w:type="spellStart"/>
+      <w:r>
+        <w:rPr>
+          <w:rFonts w:ascii="Times New Roman" w:eastAsia="Times New Roman" w:hAnsi="Times New Roman" w:cs="Times New Roman"/>
+          <w:sz w:val="26"/>
+          <w:szCs w:val="26"/>
+          <w:lang w:eastAsia="pt-BR"/>
+        </w:rPr>
+        <w:t>validarCPF</w:t>
+      </w:r>
+      <w:proofErr w:type="spellEnd"/>
+      <w:r>
+        <w:rPr>
+          <w:rFonts w:ascii="Times New Roman" w:eastAsia="Times New Roman" w:hAnsi="Times New Roman" w:cs="Times New Roman"/>
+          <w:sz w:val="26"/>
+          <w:szCs w:val="26"/>
+          <w:lang w:eastAsia="pt-BR"/>
+        </w:rPr>
+        <w:t xml:space="preserve"> e </w:t>
+      </w:r>
+      <w:proofErr w:type="spellStart"/>
+      <w:r>
+        <w:rPr>
+          <w:rFonts w:ascii="Times New Roman" w:eastAsia="Times New Roman" w:hAnsi="Times New Roman" w:cs="Times New Roman"/>
+          <w:sz w:val="26"/>
+          <w:szCs w:val="26"/>
+          <w:lang w:eastAsia="pt-BR"/>
+        </w:rPr>
+        <w:t>salvarDadosEmTXT</w:t>
+      </w:r>
+      <w:proofErr w:type="spellEnd"/>
+      <w:r>
+        <w:rPr>
+          <w:rFonts w:ascii="Times New Roman" w:eastAsia="Times New Roman" w:hAnsi="Times New Roman" w:cs="Times New Roman"/>
+          <w:sz w:val="26"/>
+          <w:szCs w:val="26"/>
+          <w:lang w:eastAsia="pt-BR"/>
+        </w:rPr>
+        <w:t>) --&gt;</w:t>
       </w:r>
     </w:p>
     <w:p>
@@ -1481,17 +2407,66 @@
           <w:rFonts w:ascii="Times New Roman" w:eastAsia="Times New Roman" w:hAnsi="Times New Roman" w:cs="Times New Roman"/>
           <w:sz w:val="26"/>
           <w:szCs w:val="26"/>
-          <w:lang w:eastAsia="pt-BR"/>
-        </w:rPr>
-      </w:pPr>
-      <w:r>
-        <w:rPr>
-          <w:rFonts w:ascii="Times New Roman" w:eastAsia="Times New Roman" w:hAnsi="Times New Roman" w:cs="Times New Roman"/>
-          <w:sz w:val="26"/>
-          <w:szCs w:val="26"/>
-          <w:lang w:eastAsia="pt-BR"/>
-        </w:rPr>
-        <w:t xml:space="preserve">    &lt;script src="app.js"&gt;&lt;/script&gt;</w:t>
+          <w:lang w:val="en-US" w:eastAsia="pt-BR"/>
+        </w:rPr>
+      </w:pPr>
+      <w:r>
+        <w:rPr>
+          <w:rFonts w:ascii="Times New Roman" w:eastAsia="Times New Roman" w:hAnsi="Times New Roman" w:cs="Times New Roman"/>
+          <w:sz w:val="26"/>
+          <w:szCs w:val="26"/>
+          <w:lang w:eastAsia="pt-BR"/>
+        </w:rPr>
+        <w:t xml:space="preserve">    </w:t>
+      </w:r>
+      <w:r>
+        <w:rPr>
+          <w:rFonts w:ascii="Times New Roman" w:eastAsia="Times New Roman" w:hAnsi="Times New Roman" w:cs="Times New Roman"/>
+          <w:sz w:val="26"/>
+          <w:szCs w:val="26"/>
+          <w:lang w:val="en-US" w:eastAsia="pt-BR"/>
+        </w:rPr>
+        <w:t xml:space="preserve">&lt;script </w:t>
+      </w:r>
+      <w:proofErr w:type="spellStart"/>
+      <w:r>
+        <w:rPr>
+          <w:rFonts w:ascii="Times New Roman" w:eastAsia="Times New Roman" w:hAnsi="Times New Roman" w:cs="Times New Roman"/>
+          <w:sz w:val="26"/>
+          <w:szCs w:val="26"/>
+          <w:lang w:val="en-US" w:eastAsia="pt-BR"/>
+        </w:rPr>
+        <w:t>src</w:t>
+      </w:r>
+      <w:proofErr w:type="spellEnd"/>
+      <w:r>
+        <w:rPr>
+          <w:rFonts w:ascii="Times New Roman" w:eastAsia="Times New Roman" w:hAnsi="Times New Roman" w:cs="Times New Roman"/>
+          <w:sz w:val="26"/>
+          <w:szCs w:val="26"/>
+          <w:lang w:val="en-US" w:eastAsia="pt-BR"/>
+        </w:rPr>
+        <w:t>="</w:t>
+      </w:r>
+      <w:proofErr w:type="spellStart"/>
+      <w:r>
+        <w:rPr>
+          <w:rFonts w:ascii="Times New Roman" w:eastAsia="Times New Roman" w:hAnsi="Times New Roman" w:cs="Times New Roman"/>
+          <w:sz w:val="26"/>
+          <w:szCs w:val="26"/>
+          <w:lang w:val="en-US" w:eastAsia="pt-BR"/>
+        </w:rPr>
+        <w:t>js</w:t>
+      </w:r>
+      <w:proofErr w:type="spellEnd"/>
+      <w:r>
+        <w:rPr>
+          <w:rFonts w:ascii="Times New Roman" w:eastAsia="Times New Roman" w:hAnsi="Times New Roman" w:cs="Times New Roman"/>
+          <w:sz w:val="26"/>
+          <w:szCs w:val="26"/>
+          <w:lang w:val="en-US" w:eastAsia="pt-BR"/>
+        </w:rPr>
+        <w:t>/utils.js"&gt;&lt;/script&gt;</w:t>
       </w:r>
     </w:p>
     <w:p>
@@ -1519,17 +2494,17 @@
           <w:rFonts w:ascii="Times New Roman" w:eastAsia="Times New Roman" w:hAnsi="Times New Roman" w:cs="Times New Roman"/>
           <w:sz w:val="26"/>
           <w:szCs w:val="26"/>
-          <w:lang w:eastAsia="pt-BR"/>
-        </w:rPr>
-      </w:pPr>
-      <w:r>
-        <w:rPr>
-          <w:rFonts w:ascii="Times New Roman" w:eastAsia="Times New Roman" w:hAnsi="Times New Roman" w:cs="Times New Roman"/>
-          <w:sz w:val="26"/>
-          <w:szCs w:val="26"/>
-          <w:lang w:eastAsia="pt-BR"/>
-        </w:rPr>
-        <w:t>&lt;/body&gt;</w:t>
+          <w:lang w:val="en-US" w:eastAsia="pt-BR"/>
+        </w:rPr>
+      </w:pPr>
+      <w:r>
+        <w:rPr>
+          <w:rFonts w:ascii="Times New Roman" w:eastAsia="Times New Roman" w:hAnsi="Times New Roman" w:cs="Times New Roman"/>
+          <w:sz w:val="26"/>
+          <w:szCs w:val="26"/>
+          <w:lang w:val="en-US" w:eastAsia="pt-BR"/>
+        </w:rPr>
+        <w:t xml:space="preserve">    </w:t>
       </w:r>
     </w:p>
     <w:p>
@@ -1565,12 +2540,156 @@
           <w:rFonts w:ascii="Times New Roman" w:eastAsia="Times New Roman" w:hAnsi="Times New Roman" w:cs="Times New Roman"/>
           <w:sz w:val="26"/>
           <w:szCs w:val="26"/>
-          <w:lang w:eastAsia="pt-BR"/>
-        </w:rPr>
-        <w:t>&lt;/html&gt;</w:t>
-      </w:r>
-    </w:p>
-    <w:p/>
+          <w:lang w:val="en-US" w:eastAsia="pt-BR"/>
+        </w:rPr>
+        <w:t xml:space="preserve">    </w:t>
+      </w:r>
+      <w:proofErr w:type="gramStart"/>
+      <w:r>
+        <w:rPr>
+          <w:rFonts w:ascii="Times New Roman" w:eastAsia="Times New Roman" w:hAnsi="Times New Roman" w:cs="Times New Roman"/>
+          <w:sz w:val="26"/>
+          <w:szCs w:val="26"/>
+          <w:lang w:eastAsia="pt-BR"/>
+        </w:rPr>
+        <w:t>&lt;!--</w:t>
+      </w:r>
+      <w:proofErr w:type="gramEnd"/>
+      <w:r>
+        <w:rPr>
+          <w:rFonts w:ascii="Times New Roman" w:eastAsia="Times New Roman" w:hAnsi="Times New Roman" w:cs="Times New Roman"/>
+          <w:sz w:val="26"/>
+          <w:szCs w:val="26"/>
+          <w:lang w:eastAsia="pt-BR"/>
+        </w:rPr>
+        <w:t xml:space="preserve"> 3. Lógica Específica da Aplicação (Consumidor que usa as funções anteriores) --&gt;</w:t>
+      </w:r>
+    </w:p>
+    <w:p>
+      <w:pPr>
+        <w:tabs>
+          <w:tab w:val="left" w:pos="916"/>
+          <w:tab w:val="left" w:pos="1832"/>
+          <w:tab w:val="left" w:pos="2748"/>
+          <w:tab w:val="left" w:pos="3664"/>
+          <w:tab w:val="left" w:pos="4580"/>
+          <w:tab w:val="left" w:pos="5496"/>
+          <w:tab w:val="left" w:pos="6412"/>
+          <w:tab w:val="left" w:pos="7328"/>
+          <w:tab w:val="left" w:pos="8244"/>
+          <w:tab w:val="left" w:pos="9160"/>
+          <w:tab w:val="left" w:pos="10076"/>
+          <w:tab w:val="left" w:pos="10992"/>
+          <w:tab w:val="left" w:pos="11908"/>
+          <w:tab w:val="left" w:pos="12824"/>
+          <w:tab w:val="left" w:pos="13740"/>
+          <w:tab w:val="left" w:pos="14656"/>
+        </w:tabs>
+        <w:spacing w:after="0" w:line="240" w:lineRule="auto"/>
+        <w:rPr>
+          <w:rFonts w:ascii="Times New Roman" w:eastAsia="Times New Roman" w:hAnsi="Times New Roman" w:cs="Times New Roman"/>
+          <w:sz w:val="26"/>
+          <w:szCs w:val="26"/>
+          <w:lang w:val="en-US" w:eastAsia="pt-BR"/>
+        </w:rPr>
+      </w:pPr>
+      <w:r>
+        <w:rPr>
+          <w:rFonts w:ascii="Times New Roman" w:eastAsia="Times New Roman" w:hAnsi="Times New Roman" w:cs="Times New Roman"/>
+          <w:sz w:val="26"/>
+          <w:szCs w:val="26"/>
+          <w:lang w:eastAsia="pt-BR"/>
+        </w:rPr>
+        <w:t xml:space="preserve">    </w:t>
+      </w:r>
+      <w:r>
+        <w:rPr>
+          <w:rFonts w:ascii="Times New Roman" w:eastAsia="Times New Roman" w:hAnsi="Times New Roman" w:cs="Times New Roman"/>
+          <w:sz w:val="26"/>
+          <w:szCs w:val="26"/>
+          <w:lang w:val="en-US" w:eastAsia="pt-BR"/>
+        </w:rPr>
+        <w:t xml:space="preserve">&lt;script </w:t>
+      </w:r>
+      <w:proofErr w:type="spellStart"/>
+      <w:r>
+        <w:rPr>
+          <w:rFonts w:ascii="Times New Roman" w:eastAsia="Times New Roman" w:hAnsi="Times New Roman" w:cs="Times New Roman"/>
+          <w:sz w:val="26"/>
+          <w:szCs w:val="26"/>
+          <w:lang w:val="en-US" w:eastAsia="pt-BR"/>
+        </w:rPr>
+        <w:t>src</w:t>
+      </w:r>
+      <w:proofErr w:type="spellEnd"/>
+      <w:r>
+        <w:rPr>
+          <w:rFonts w:ascii="Times New Roman" w:eastAsia="Times New Roman" w:hAnsi="Times New Roman" w:cs="Times New Roman"/>
+          <w:sz w:val="26"/>
+          <w:szCs w:val="26"/>
+          <w:lang w:val="en-US" w:eastAsia="pt-BR"/>
+        </w:rPr>
+        <w:t>="</w:t>
+      </w:r>
+      <w:proofErr w:type="spellStart"/>
+      <w:r>
+        <w:rPr>
+          <w:rFonts w:ascii="Times New Roman" w:eastAsia="Times New Roman" w:hAnsi="Times New Roman" w:cs="Times New Roman"/>
+          <w:sz w:val="26"/>
+          <w:szCs w:val="26"/>
+          <w:lang w:val="en-US" w:eastAsia="pt-BR"/>
+        </w:rPr>
+        <w:t>js</w:t>
+      </w:r>
+      <w:proofErr w:type="spellEnd"/>
+      <w:r>
+        <w:rPr>
+          <w:rFonts w:ascii="Times New Roman" w:eastAsia="Times New Roman" w:hAnsi="Times New Roman" w:cs="Times New Roman"/>
+          <w:sz w:val="26"/>
+          <w:szCs w:val="26"/>
+          <w:lang w:val="en-US" w:eastAsia="pt-BR"/>
+        </w:rPr>
+        <w:t>/app.js"&gt;&lt;/script&gt;</w:t>
+      </w:r>
+    </w:p>
+    <w:p>
+      <w:pPr>
+        <w:tabs>
+          <w:tab w:val="left" w:pos="916"/>
+          <w:tab w:val="left" w:pos="1832"/>
+          <w:tab w:val="left" w:pos="2748"/>
+          <w:tab w:val="left" w:pos="3664"/>
+          <w:tab w:val="left" w:pos="4580"/>
+          <w:tab w:val="left" w:pos="5496"/>
+          <w:tab w:val="left" w:pos="6412"/>
+          <w:tab w:val="left" w:pos="7328"/>
+          <w:tab w:val="left" w:pos="8244"/>
+          <w:tab w:val="left" w:pos="9160"/>
+          <w:tab w:val="left" w:pos="10076"/>
+          <w:tab w:val="left" w:pos="10992"/>
+          <w:tab w:val="left" w:pos="11908"/>
+          <w:tab w:val="left" w:pos="12824"/>
+          <w:tab w:val="left" w:pos="13740"/>
+          <w:tab w:val="left" w:pos="14656"/>
+        </w:tabs>
+        <w:spacing w:after="0" w:line="240" w:lineRule="auto"/>
+        <w:rPr>
+          <w:rFonts w:ascii="Times New Roman" w:eastAsia="Times New Roman" w:hAnsi="Times New Roman" w:cs="Times New Roman"/>
+          <w:sz w:val="26"/>
+          <w:szCs w:val="26"/>
+          <w:lang w:eastAsia="pt-BR"/>
+        </w:rPr>
+      </w:pPr>
+    </w:p>
+    <w:p>
+      <w:pPr>
+        <w:rPr>
+          <w:rFonts w:ascii="Times New Roman" w:hAnsi="Times New Roman" w:cs="Times New Roman"/>
+          <w:sz w:val="26"/>
+          <w:szCs w:val="26"/>
+        </w:rPr>
+      </w:pPr>
+    </w:p>
     <w:sectPr>
       <w:pgSz w:w="11906" w:h="16838"/>
       <w:pgMar w:top="1417" w:right="1701" w:bottom="1417" w:left="1701" w:header="708" w:footer="708" w:gutter="0"/>
@@ -1579,6 +2698,127 @@
     </w:sectPr>
   </w:body>
 </w:document>
+</file>
+
+<file path=word/numbering.xml><?xml version="1.0" encoding="utf-8"?>
+<w:numbering xmlns:wpc="http://schemas.microsoft.com/office/word/2010/wordprocessingCanvas" xmlns:cx="http://schemas.microsoft.com/office/drawing/2014/chartex" xmlns:cx1="http://schemas.microsoft.com/office/drawing/2015/9/8/chartex" xmlns:cx2="http://schemas.microsoft.com/office/drawing/2015/10/21/chartex" xmlns:cx3="http://schemas.microsoft.com/office/drawing/2016/5/9/chartex" xmlns:cx4="http://schemas.microsoft.com/office/drawing/2016/5/10/chartex" xmlns:cx5="http://schemas.microsoft.com/office/drawing/2016/5/11/chartex" xmlns:cx6="http://schemas.microsoft.com/office/drawing/2016/5/12/chartex" xmlns:cx7="http://schemas.microsoft.com/office/drawing/2016/5/13/chartex" xmlns:cx8="http://schemas.microsoft.com/office/drawing/2016/5/14/chartex" xmlns:mc="http://schemas.openxmlformats.org/markup-compatibility/2006" xmlns:aink="http://schemas.microsoft.com/office/drawing/2016/ink" xmlns:am3d="http://schemas.microsoft.com/office/drawing/2017/model3d" xmlns:o="urn:schemas-microsoft-com:office:office" xmlns:r="http://schemas.openxmlformats.org/officeDocument/2006/relationships" xmlns:m="http://schemas.openxmlformats.org/officeDocument/2006/math" xmlns:v="urn:schemas-microsoft-com:vml" xmlns:wp14="http://schemas.microsoft.com/office/word/2010/wordprocessingDrawing" xmlns:wp="http://schemas.openxmlformats.org/drawingml/2006/wordprocessingDrawing" xmlns:w10="urn:schemas-microsoft-com:office:word" xmlns:w="http://schemas.openxmlformats.org/wordprocessingml/2006/main" xmlns:w14="http://schemas.microsoft.com/office/word/2010/wordml" xmlns:w15="http://schemas.microsoft.com/office/word/2012/wordml" xmlns:w16cex="http://schemas.microsoft.com/office/word/2018/wordml/cex" xmlns:w16cid="http://schemas.microsoft.com/office/word/2016/wordml/cid" xmlns:w16="http://schemas.microsoft.com/office/word/2018/wordml" xmlns:w16sdtdh="http://schemas.microsoft.com/office/word/2020/wordml/sdtdatahash" xmlns:w16se="http://schemas.microsoft.com/office/word/2015/wordml/symex" xmlns:wpg="http://schemas.microsoft.com/office/word/2010/wordprocessingGroup" xmlns:wpi="http://schemas.microsoft.com/office/word/2010/wordprocessingInk" xmlns:wne="http://schemas.microsoft.com/office/word/2006/wordml" xmlns:wps="http://schemas.microsoft.com/office/word/2010/wordprocessingShape" mc:Ignorable="w14 w15 w16se w16cid w16 w16cex w16sdtdh wp14">
+  <w:abstractNum w:abstractNumId="0" w15:restartNumberingAfterBreak="0">
+    <w:nsid w:val="505A655E"/>
+    <w:multiLevelType w:val="multilevel"/>
+    <w:tmpl w:val="08947274"/>
+    <w:lvl w:ilvl="0">
+      <w:start w:val="1"/>
+      <w:numFmt w:val="decimal"/>
+      <w:lvlText w:val="%1."/>
+      <w:lvlJc w:val="left"/>
+      <w:pPr>
+        <w:tabs>
+          <w:tab w:val="num" w:pos="720"/>
+        </w:tabs>
+        <w:ind w:left="720" w:hanging="360"/>
+      </w:pPr>
+    </w:lvl>
+    <w:lvl w:ilvl="1" w:tentative="1">
+      <w:start w:val="1"/>
+      <w:numFmt w:val="decimal"/>
+      <w:lvlText w:val="%2."/>
+      <w:lvlJc w:val="left"/>
+      <w:pPr>
+        <w:tabs>
+          <w:tab w:val="num" w:pos="1440"/>
+        </w:tabs>
+        <w:ind w:left="1440" w:hanging="360"/>
+      </w:pPr>
+    </w:lvl>
+    <w:lvl w:ilvl="2" w:tentative="1">
+      <w:start w:val="1"/>
+      <w:numFmt w:val="decimal"/>
+      <w:lvlText w:val="%3."/>
+      <w:lvlJc w:val="left"/>
+      <w:pPr>
+        <w:tabs>
+          <w:tab w:val="num" w:pos="2160"/>
+        </w:tabs>
+        <w:ind w:left="2160" w:hanging="360"/>
+      </w:pPr>
+    </w:lvl>
+    <w:lvl w:ilvl="3" w:tentative="1">
+      <w:start w:val="1"/>
+      <w:numFmt w:val="decimal"/>
+      <w:lvlText w:val="%4."/>
+      <w:lvlJc w:val="left"/>
+      <w:pPr>
+        <w:tabs>
+          <w:tab w:val="num" w:pos="2880"/>
+        </w:tabs>
+        <w:ind w:left="2880" w:hanging="360"/>
+      </w:pPr>
+    </w:lvl>
+    <w:lvl w:ilvl="4" w:tentative="1">
+      <w:start w:val="1"/>
+      <w:numFmt w:val="decimal"/>
+      <w:lvlText w:val="%5."/>
+      <w:lvlJc w:val="left"/>
+      <w:pPr>
+        <w:tabs>
+          <w:tab w:val="num" w:pos="3600"/>
+        </w:tabs>
+        <w:ind w:left="3600" w:hanging="360"/>
+      </w:pPr>
+    </w:lvl>
+    <w:lvl w:ilvl="5" w:tentative="1">
+      <w:start w:val="1"/>
+      <w:numFmt w:val="decimal"/>
+      <w:lvlText w:val="%6."/>
+      <w:lvlJc w:val="left"/>
+      <w:pPr>
+        <w:tabs>
+          <w:tab w:val="num" w:pos="4320"/>
+        </w:tabs>
+        <w:ind w:left="4320" w:hanging="360"/>
+      </w:pPr>
+    </w:lvl>
+    <w:lvl w:ilvl="6" w:tentative="1">
+      <w:start w:val="1"/>
+      <w:numFmt w:val="decimal"/>
+      <w:lvlText w:val="%7."/>
+      <w:lvlJc w:val="left"/>
+      <w:pPr>
+        <w:tabs>
+          <w:tab w:val="num" w:pos="5040"/>
+        </w:tabs>
+        <w:ind w:left="5040" w:hanging="360"/>
+      </w:pPr>
+    </w:lvl>
+    <w:lvl w:ilvl="7" w:tentative="1">
+      <w:start w:val="1"/>
+      <w:numFmt w:val="decimal"/>
+      <w:lvlText w:val="%8."/>
+      <w:lvlJc w:val="left"/>
+      <w:pPr>
+        <w:tabs>
+          <w:tab w:val="num" w:pos="5760"/>
+        </w:tabs>
+        <w:ind w:left="5760" w:hanging="360"/>
+      </w:pPr>
+    </w:lvl>
+    <w:lvl w:ilvl="8" w:tentative="1">
+      <w:start w:val="1"/>
+      <w:numFmt w:val="decimal"/>
+      <w:lvlText w:val="%9."/>
+      <w:lvlJc w:val="left"/>
+      <w:pPr>
+        <w:tabs>
+          <w:tab w:val="num" w:pos="6480"/>
+        </w:tabs>
+        <w:ind w:left="6480" w:hanging="360"/>
+      </w:pPr>
+    </w:lvl>
+  </w:abstractNum>
+  <w:num w:numId="1">
+    <w:abstractNumId w:val="0"/>
+  </w:num>
+</w:numbering>
 </file>
 
 <file path=word/styles.xml><?xml version="1.0" encoding="utf-8"?>
@@ -2203,6 +3443,26 @@
     <w:basedOn w:val="Fontepargpadro"/>
     <w:rsid w:val="00EC3CB8"/>
   </w:style>
+  <w:style w:type="character" w:customStyle="1" w:styleId="ng-tns-c2772358427-160">
+    <w:name w:val="ng-tns-c2772358427-160"/>
+    <w:basedOn w:val="Fontepargpadro"/>
+    <w:rsid w:val="00156C7F"/>
+  </w:style>
+  <w:style w:type="character" w:customStyle="1" w:styleId="ng-tns-c2772358427-161">
+    <w:name w:val="ng-tns-c2772358427-161"/>
+    <w:basedOn w:val="Fontepargpadro"/>
+    <w:rsid w:val="00156C7F"/>
+  </w:style>
+  <w:style w:type="character" w:customStyle="1" w:styleId="hljs-meta">
+    <w:name w:val="hljs-meta"/>
+    <w:basedOn w:val="Fontepargpadro"/>
+    <w:rsid w:val="00156C7F"/>
+  </w:style>
+  <w:style w:type="character" w:customStyle="1" w:styleId="hljs-meta-keyword">
+    <w:name w:val="hljs-meta-keyword"/>
+    <w:basedOn w:val="Fontepargpadro"/>
+    <w:rsid w:val="00156C7F"/>
+  </w:style>
 </w:styles>
 </file>
 

</xml_diff>